<commit_message>
docs(report): align executive report with notebook results
- Clarify the base of each percentage in the signals table
- Fix sector volume ranking among closed/terminated contracts
- Reword Licitación pública value finding
- Fix test labels, effect size wording and 'proxis' typo
</commit_message>
<xml_diff>
--- a/docs/Informe_Ejecutivo_Taller1.docx
+++ b/docs/Informe_Ejecutivo_Taller1.docx
@@ -113,7 +113,7 @@
           <w:sz w:val="22"/>
           <w:szCs w:val="22"/>
         </w:rPr>
-        <w:t>La siguiente tabla resume la magnitud de cada una de las tres señales de desviación sobre el total de contratos analizados.</w:t>
+        <w:t>La siguiente tabla resume la magnitud de cada una de las tres señales de desviación. La columna Definición indica sobre qué base se calcula cada porcentaje.</w:t>
       </w:r>
     </w:p>
     <w:tbl>
@@ -416,7 +416,7 @@
                 <w:sz w:val="18"/>
                 <w:szCs w:val="18"/>
               </w:rPr>
-              <w:t>Contratos cerrados o terminados con valor pagado igual a cero.</w:t>
+              <w:t>Contratos cerrados o terminados con valor pagado igual a cero, como porcentaje del total de contratos.</w:t>
             </w:r>
           </w:p>
         </w:tc>
@@ -921,21 +921,19 @@
                 <w:sz w:val="18"/>
                 <w:szCs w:val="18"/>
               </w:rPr>
-              <w:t xml:space="preserve">3.2 Modalidad no </w:t>
-            </w:r>
-            <w:r>
-              <w:rPr>
-                <w:sz w:val="18"/>
-                <w:szCs w:val="18"/>
-              </w:rPr>
-              <w:t>-</w:t>
-            </w:r>
-            <w:r>
-              <w:rPr>
-                <w:sz w:val="18"/>
-                <w:szCs w:val="18"/>
-              </w:rPr>
-              <w:t>ejecutado</w:t>
+              <w:t>3.2 Modalidad - no ejecutado</w:t>
+            </w:r>
+            <w:r>
+              <w:rPr>
+                <w:sz w:val="18"/>
+                <w:szCs w:val="18"/>
+              </w:rPr>
+            </w:r>
+            <w:r>
+              <w:rPr>
+                <w:sz w:val="18"/>
+                <w:szCs w:val="18"/>
+              </w:rPr>
             </w:r>
           </w:p>
         </w:tc>
@@ -989,7 +987,7 @@
                 <w:sz w:val="18"/>
                 <w:szCs w:val="18"/>
               </w:rPr>
-              <w:t>Cramér's V = 0.0931 (débil)</w:t>
+              <w:t>Cramér's V = 0.0931 (despreciable)</w:t>
             </w:r>
           </w:p>
         </w:tc>
@@ -1053,21 +1051,19 @@
                 <w:sz w:val="18"/>
                 <w:szCs w:val="18"/>
               </w:rPr>
-              <w:t xml:space="preserve">3.3 Modalidad sin </w:t>
-            </w:r>
-            <w:r>
-              <w:rPr>
-                <w:sz w:val="18"/>
-                <w:szCs w:val="18"/>
-              </w:rPr>
-              <w:t>-</w:t>
-            </w:r>
-            <w:r>
-              <w:rPr>
-                <w:sz w:val="18"/>
-                <w:szCs w:val="18"/>
-              </w:rPr>
-              <w:t>liquidar</w:t>
+              <w:t>3.3 Modalidad - sin liquidar</w:t>
+            </w:r>
+            <w:r>
+              <w:rPr>
+                <w:sz w:val="18"/>
+                <w:szCs w:val="18"/>
+              </w:rPr>
+            </w:r>
+            <w:r>
+              <w:rPr>
+                <w:sz w:val="18"/>
+                <w:szCs w:val="18"/>
+              </w:rPr>
             </w:r>
           </w:p>
         </w:tc>
@@ -1183,21 +1179,19 @@
                 <w:sz w:val="18"/>
                 <w:szCs w:val="18"/>
               </w:rPr>
-              <w:t xml:space="preserve">3.7 Valor del contrato </w:t>
-            </w:r>
-            <w:r>
-              <w:rPr>
-                <w:sz w:val="18"/>
-                <w:szCs w:val="18"/>
-              </w:rPr>
-              <w:t>-</w:t>
-            </w:r>
-            <w:r>
-              <w:rPr>
-                <w:sz w:val="18"/>
-                <w:szCs w:val="18"/>
-              </w:rPr>
-              <w:t>sin liquidar</w:t>
+              <w:t>3.7 Valor del contrato - sin liquidar</w:t>
+            </w:r>
+            <w:r>
+              <w:rPr>
+                <w:sz w:val="18"/>
+                <w:szCs w:val="18"/>
+              </w:rPr>
+            </w:r>
+            <w:r>
+              <w:rPr>
+                <w:sz w:val="18"/>
+                <w:szCs w:val="18"/>
+              </w:rPr>
             </w:r>
           </w:p>
         </w:tc>
@@ -3752,7 +3746,7 @@
                 <w:sz w:val="18"/>
                 <w:szCs w:val="18"/>
               </w:rPr>
-              <w:t xml:space="preserve">Mayor volumen del </w:t>
+              <w:t>Segundo mayor volumen entre cerrados o terminados, riesgo cercano al promedio</w:t>
             </w:r>
             <w:proofErr w:type="spellStart"/>
             <w:r>
@@ -3760,7 +3754,6 @@
                 <w:sz w:val="18"/>
                 <w:szCs w:val="18"/>
               </w:rPr>
-              <w:t>dataset</w:t>
             </w:r>
             <w:proofErr w:type="spellEnd"/>
             <w:r>
@@ -3768,7 +3761,6 @@
                 <w:sz w:val="18"/>
                 <w:szCs w:val="18"/>
               </w:rPr>
-              <w:t>, riesgo cercano al promedio</w:t>
             </w:r>
           </w:p>
         </w:tc>
@@ -3884,7 +3876,7 @@
                 <w:sz w:val="18"/>
                 <w:szCs w:val="18"/>
               </w:rPr>
-              <w:t>Segundo mayor volumen, riesgo bajo</w:t>
+              <w:t>Mayor volumen entre cerrados o terminados, riesgo bajo</w:t>
             </w:r>
           </w:p>
         </w:tc>
@@ -5187,21 +5179,19 @@
           <w:sz w:val="22"/>
           <w:szCs w:val="22"/>
         </w:rPr>
-        <w:t xml:space="preserve">En 7 de las 9 modalidades, la mediana del valor es más alta entre los contratos liquidados que entre los sin liquidar, lo que sugiere que dentro de la mayoría de </w:t>
+        <w:t>En 7 de las 9 modalidades, la mediana del valor es más alta entre los contratos liquidados que entre los sin liquidar, lo que sugiere que dentro de la mayoría de las modalidades son los contratos de menor valor los que tienden a quedar sin liquidar. La excepción más relevante es Licitación pública, donde los contratos sin liquidar tienen una mediana de valor mayor que los liquidados (1.221 millones frente a 900 millones), lo que indica que en la modalidad de mayor cuantía son justamente los contratos más costosos los que tienden a quedar sin liquidar.</w:t>
       </w:r>
       <w:r>
         <w:rPr>
           <w:sz w:val="22"/>
           <w:szCs w:val="22"/>
         </w:rPr>
-        <w:t>las modalidades</w:t>
       </w:r>
       <w:r>
         <w:rPr>
           <w:sz w:val="22"/>
           <w:szCs w:val="22"/>
         </w:rPr>
-        <w:t xml:space="preserve"> son los contratos de menor valor los que tienden a quedar sin liquidar. La excepción más relevante es Licitación pública, donde los contratos sin liquidar tienen una mediana de valor mayor que los liquidados (1.221 millones frente a 900 millones), lo que significa que los contratos sin liquidar más costosos de toda la base de datos están concentrados en esta modalidad.</w:t>
       </w:r>
     </w:p>
     <w:p>
@@ -5298,8 +5288,7 @@
           <w:sz w:val="22"/>
           <w:szCs w:val="22"/>
         </w:rPr>
-        <w:lastRenderedPageBreak/>
-        <w:t>El riesgo por sector no está relacionado con el volumen de contratos. Ley de Justicia (8.676 contratos, 71.35%) y Salud y Protección Social (11.097 contratos, 70.67%) se ubican claramente por encima del promedio general (55.31%) y combinan una tasa alta con una muestra grande, lo que los convierte en los hallazgos más sólidos y accionables de todo el análisis. defensa, el segundo sector de mayor volumen (23.539 contratos), se ubica muy por debajo del promedio (33.10%), y Servicio Público, el de mayor volumen (17.594 contratos), se ubica prácticamente sobre la línea de referencia (54.30%). Los porcentajes más altos del gráfico (Ciencia Tecnología con 90.97%, Información Estadística con 78.35%) corresponden a sectores de volumen bajo (321 y 231 contratos), por lo que deben interpretarse con más cautela.</w:t>
+        <w:t>El riesgo por sector no está relacionado con el volumen de contratos. Ley de Justicia (8.676 contratos, 71.35%) y Salud y Protección Social (11.097 contratos, 70.67%) se ubican claramente por encima del promedio general (55.31%) y combinan una tasa alta con una muestra grande, lo que los convierte en los hallazgos más sólidos y accionables de todo el análisis. defensa, el sector de mayor volumen entre los contratos cerrados o terminados (23.539 contratos), se ubica muy por debajo del promedio (33.10%), y Servicio Público, el segundo en volumen (17.594 contratos), se ubica prácticamente sobre la línea de referencia (54.30%). Los porcentajes más altos del gráfico (Ciencia Tecnología con 90.97%, Información Estadística con 78.35%) corresponden a sectores de volumen bajo (321 y 231 contratos), por lo que deben interpretarse con más cautela.</w:t>
       </w:r>
     </w:p>
     <w:p>
@@ -5329,21 +5318,19 @@
           <w:sz w:val="22"/>
           <w:szCs w:val="22"/>
         </w:rPr>
-        <w:t xml:space="preserve">Ley de Justicia (8.676 contratos, 71.35% sin liquidar) y Salud y Protección Social (11.097 contratos, 70.67% sin liquidar) son los hallazgos más sólidos de todo el análisis, combinan una tasa muy por encima del promedio general (55.31%) con un volumen de contratos suficientemente grande para que la estimación sea confiable. Se recomienda que estos dos sectores sean el primer criterio de focalización. En contraste, defensa, </w:t>
+        <w:t>Ley de Justicia (8.676 contratos, 71.35% sin liquidar) y Salud y Protección Social (11.097 contratos, 70.67% sin liquidar) son los hallazgos más sólidos de todo el análisis, combinan una tasa muy por encima del promedio general (55.31%) con un volumen de contratos suficientemente grande para que la estimación sea confiable. Se recomienda que estos dos sectores sean el primer criterio de focalización. En contraste, defensa, a pesar de ser el sector de mayor volumen entre los contratos cerrados o terminados (23.539 contratos), tiene una tasa de sin liquidar notablemente baja (33.10%), y Servicio Público, el segundo en volumen (17.594 contratos), se ubica prácticamente en el promedio general (54.30%), ninguno de los dos debería priorizarse por esta señal.</w:t>
       </w:r>
       <w:r>
         <w:rPr>
           <w:sz w:val="22"/>
           <w:szCs w:val="22"/>
         </w:rPr>
-        <w:t>a pesar de</w:t>
       </w:r>
       <w:r>
         <w:rPr>
           <w:sz w:val="22"/>
           <w:szCs w:val="22"/>
         </w:rPr>
-        <w:t xml:space="preserve"> ser el segundo sector de mayor volumen (23.539 contratos), tiene una tasa de sin liquidar notablemente baja (33.10%), y Servicio Público, el sector de mayor volumen (17.594 contratos), se ubica prácticamente en el promedio general (54.30%), ninguno de los dos debería priorizarse por esta señal.</w:t>
       </w:r>
     </w:p>
     <w:p>
@@ -5487,21 +5474,19 @@
           <w:sz w:val="22"/>
           <w:szCs w:val="22"/>
         </w:rPr>
-        <w:t xml:space="preserve">Las banderas de no ejecución y de cierre sin liquidar son </w:t>
+        <w:t>Las banderas de no ejecución y de cierre sin liquidar son proxies construidos a partir de reglas simples, y las categorías No aplica y No Definido de destino del gasto, así como No Definido de sector (excluida de la prueba correspondiente por tener solo 9 contratos), probablemente reflejan problemas de registro o clasificación incompleta más que una categoría sustantiva, lo que limita la interpretación de esos resultados específicos.</w:t>
       </w:r>
       <w:r>
         <w:rPr>
           <w:sz w:val="22"/>
           <w:szCs w:val="22"/>
         </w:rPr>
-        <w:t>proxis</w:t>
       </w:r>
       <w:r>
         <w:rPr>
           <w:sz w:val="22"/>
           <w:szCs w:val="22"/>
         </w:rPr>
-        <w:t xml:space="preserve"> construidos a partir de reglas simples, y las categorías No aplica y No Definido de destino del gasto, así como No Definido de sector (excluida de la prueba correspondiente por tener solo 9 contratos), probablemente reflejan problemas de registro o clasificación incompleta más que una categoría sustantiva, lo que limita la interpretación de esos resultados específicos.</w:t>
       </w:r>
     </w:p>
     <w:p>

</xml_diff>

<commit_message>
docs(report): update executive report to 2020-2024 results
- Justify analysis period and update all figures and tables
- Extend hypothesis test table with new tests and non-significant results
- Add heatmap figure and revise targeting criteria and limitations
</commit_message>
<xml_diff>
--- a/docs/Informe_Ejecutivo_Taller1.docx
+++ b/docs/Informe_Ejecutivo_Taller1.docx
@@ -31,7 +31,7 @@
           <w:sz w:val="28"/>
           <w:szCs w:val="28"/>
         </w:rPr>
-        <w:t>Criterios de focalización de supervisión en contratos de Bienes y Suministros, SECOP II (2019-2025)</w:t>
+        <w:t>Criterios de focalización de supervisión en contratos de Bienes y Suministros, SECOP II (2020-2024)</w:t>
       </w:r>
     </w:p>
     <w:p>
@@ -80,7 +80,7 @@
           <w:sz w:val="22"/>
           <w:szCs w:val="22"/>
         </w:rPr>
-        <w:t>Este documento resume los resultados del análisis realizado sobre 196.391 contratos de bienes y suministros registrados en SECOP II entre 2019 y 2025. El objetivo es proponer criterios de focalización de supervisión basados en evidencia estadística, evaluando cuatro factores disponibles en los datos: la modalidad de contratación, el valor del contrato, el destino del gasto, y el sector.</w:t>
+        <w:t>Este documento resume los resultados del análisis realizado sobre 139.853 contratos de bienes y suministros firmados entre 2020 y 2024 y registrados en SECOP II. El objetivo es proponer criterios de focalización de supervisión basados en evidencia estadística, evaluando cinco factores conocidos desde la firma del contrato: la modalidad de contratación, el valor del contrato, el destino del gasto, el sector y el tipo de entidad.</w:t>
       </w:r>
     </w:p>
     <w:p>
@@ -92,7 +92,19 @@
           <w:sz w:val="22"/>
           <w:szCs w:val="22"/>
         </w:rPr>
-        <w:t>El análisis parte de tres señales de desviación identificadas durante el entendimiento inicial de los datos: la adición de plazo sobre el contrato original, el cierre de contratos sin haber ejecutado presupuesto, y el cierre de contratos sin liquidación. Sobre estas tres señales se evaluó cuáles de los cuatro factores permiten explicar y anticipar el riesgo, y con qué fuerza.</w:t>
+        <w:t>El análisis parte de tres señales de desviación: la adición de plazo sobre el contrato original, el cierre de contratos sin ningún pago registrado, y el cierre de contratos sin liquidación. Sobre estas tres señales se evaluó cuáles de los cinco factores permiten anticipar el riesgo, y con qué fuerza.</w:t>
+      </w:r>
+    </w:p>
+    <w:p>
+      <w:pPr>
+        <w:jc w:val="both"/>
+      </w:pPr>
+      <w:r>
+        <w:rPr>
+          <w:sz w:val="22"/>
+          <w:szCs w:val="22"/>
+        </w:rPr>
+        <w:t>El dataset original tiene 196.391 contratos firmados entre 2019 y 2025, pero esos años no son comparables entre sí. En 2019 el 32.40% de los contratos quedó en estado Aprobado, ninguno aparece En ejecución y el 72.13% no tiene pagos registrados, señal de un uso todavía incompleto de SECOP II. En 2025 solo el 36.03% de los contratos estaba cerrado o terminado, y muchos aún no habían cumplido el plazo legal para liquidarse. Por eso el análisis se restringe al periodo 2020-2024, en el que el registro del ciclo de vida del contrato es consistente.</w:t>
       </w:r>
     </w:p>
     <w:p>
@@ -298,7 +310,7 @@
                 <w:sz w:val="18"/>
                 <w:szCs w:val="18"/>
               </w:rPr>
-              <w:t>9.51%</w:t>
+              <w:t>7.90%</w:t>
             </w:r>
           </w:p>
         </w:tc>
@@ -324,7 +336,7 @@
                 <w:sz w:val="18"/>
                 <w:szCs w:val="18"/>
               </w:rPr>
-              <w:t>Contratos con días adicionados mayores a cero sobre el plazo original.</w:t>
+              <w:t>Contratos con días adicionados mayores a cero, sobre todos los contratos del periodo.</w:t>
             </w:r>
           </w:p>
         </w:tc>
@@ -389,7 +401,7 @@
                 <w:sz w:val="18"/>
                 <w:szCs w:val="18"/>
               </w:rPr>
-              <w:t>21.79%</w:t>
+              <w:t>42.54%</w:t>
             </w:r>
           </w:p>
         </w:tc>
@@ -416,7 +428,7 @@
                 <w:sz w:val="18"/>
                 <w:szCs w:val="18"/>
               </w:rPr>
-              <w:t>Contratos cerrados o terminados con valor pagado igual a cero, como porcentaje del total de contratos.</w:t>
+              <w:t>Contratos sin ningún pago registrado, sobre los contratos cerrados o terminados.</w:t>
             </w:r>
           </w:p>
         </w:tc>
@@ -479,7 +491,7 @@
                 <w:sz w:val="18"/>
                 <w:szCs w:val="18"/>
               </w:rPr>
-              <w:t>55.31%</w:t>
+              <w:t>57.40%</w:t>
             </w:r>
           </w:p>
         </w:tc>
@@ -505,7 +517,7 @@
                 <w:sz w:val="18"/>
                 <w:szCs w:val="18"/>
               </w:rPr>
-              <w:t>Contratos cerrados o terminados sin liquidación, sobre el subconjunto de contratos con liquidación confiable.</w:t>
+              <w:t>Contratos sin liquidación, sobre los contratos cerrados o terminados.</w:t>
             </w:r>
           </w:p>
         </w:tc>
@@ -529,7 +541,7 @@
           <w:sz w:val="22"/>
           <w:szCs w:val="22"/>
         </w:rPr>
-        <w:t>Adicionalmente, durante el entendimiento inicial se documentaron y trataron 9 problemas de calidad de datos (identificados como P1 a P9), corrigiéndolos de forma no destructiva mediante banderas de confiabilidad, sin eliminar registros del conjunto de datos original.</w:t>
+        <w:t>Adicionalmente, durante el entendimiento inicial se documentaron y trataron 9 problemas de calidad de datos (identificados como P1 a P9), corrigiéndolos de forma no destructiva mediante banderas de confiabilidad, sin eliminar registros del conjunto de datos original, y se justificó con datos la elección del periodo 2020-2024.</w:t>
       </w:r>
     </w:p>
     <w:p>
@@ -541,15 +553,13 @@
           <w:sz w:val="22"/>
           <w:szCs w:val="22"/>
         </w:rPr>
-        <w:t xml:space="preserve">De los cuatro factores evaluados, sector resultó ser el predictor más fuerte encontrado en todo el análisis (Cramér's V de 0.2815 frente a cierre sin liquidar), seguido de modalidad de contratación (Cramér's V de 0.1748 en su mejor resultado, también frente a cierre sin liquidar), y de destino del gasto (Cramér's V de 0.1128 frente a no ejecución, impulsado en buena parte por categorías de registro indefinido). Valor del contrato, evaluado de forma </w:t>
+        <w:t>De los cinco factores evaluados, sector resultó ser el predictor más fuerte (Cramér's V de 0.2939 frente a cierre sin liquidar), seguido de modalidad de contratación (0.2066 frente a no ejecución y 0.1728 frente a cierre sin liquidar), destino del gasto (0.1602 frente a no ejecución) y el orden territorial o nacional de la entidad (0.1180 frente a cierre sin liquidar). El valor del contrato, evaluado de forma independiente, resultó ser un predictor débil (correlación rank-biserial de -0.1480), y el carácter centralizado o descentralizado de la entidad tuvo un efecto despreciable (0.0357).</w:t>
       </w:r>
       <w:r>
         <w:rPr>
           <w:sz w:val="22"/>
           <w:szCs w:val="22"/>
         </w:rPr>
-        <w:lastRenderedPageBreak/>
-        <w:t xml:space="preserve">independiente sin distinguir por modalidad, resultó ser el factor más débil (correlación </w:t>
       </w:r>
       <w:proofErr w:type="spellStart"/>
       <w:r>
@@ -557,7 +567,6 @@
           <w:sz w:val="22"/>
           <w:szCs w:val="22"/>
         </w:rPr>
-        <w:t>rank</w:t>
       </w:r>
       <w:proofErr w:type="spellEnd"/>
       <w:r>
@@ -565,7 +574,6 @@
           <w:sz w:val="22"/>
           <w:szCs w:val="22"/>
         </w:rPr>
-        <w:t>-biserial de apenas -0.1554), su relación con el riesgo depende de con qué otra variable se combine.</w:t>
       </w:r>
     </w:p>
     <w:p>
@@ -586,7 +594,7 @@
           <w:sz w:val="22"/>
           <w:szCs w:val="22"/>
         </w:rPr>
-        <w:t>Para cada señal de desviación se formuló una hipótesis nula de independencia entre el factor evaluado y la variable objetivo, y se contrastó con una prueba estadística adecuada al tipo de variable, definiendo previamente un umbral de relevancia práctica para evitar interpretar significancia estadística (fácil de obtener con casi 200.000 registros) como relevancia real.</w:t>
+        <w:t>Para cada señal de desviación se formuló una hipótesis nula de independencia entre el factor evaluado y la variable objetivo, y se contrastó con una prueba estadística adecuada al tipo de variable, definiendo previamente un umbral de relevancia práctica para evitar interpretar significancia estadística (fácil de obtener con cerca de 140.000 registros) como relevancia real.</w:t>
       </w:r>
     </w:p>
     <w:tbl>
@@ -776,21 +784,19 @@
                 <w:sz w:val="18"/>
                 <w:szCs w:val="18"/>
               </w:rPr>
-              <w:t xml:space="preserve">3.1 Modalidad </w:t>
-            </w:r>
-            <w:r>
-              <w:rPr>
-                <w:sz w:val="18"/>
-                <w:szCs w:val="18"/>
-              </w:rPr>
-              <w:t xml:space="preserve">- </w:t>
-            </w:r>
-            <w:r>
-              <w:rPr>
-                <w:sz w:val="18"/>
-                <w:szCs w:val="18"/>
-              </w:rPr>
-              <w:t>adici</w:t>
+              <w:t>3.1 Modalidad - adición de plazo (días)</w:t>
+            </w:r>
+            <w:r>
+              <w:rPr>
+                <w:sz w:val="18"/>
+                <w:szCs w:val="18"/>
+              </w:rPr>
+            </w:r>
+            <w:r>
+              <w:rPr>
+                <w:sz w:val="18"/>
+                <w:szCs w:val="18"/>
+              </w:rPr>
             </w:r>
             <w:r>
               <w:rPr>
@@ -798,14 +804,12 @@
                 <w:sz w:val="18"/>
                 <w:szCs w:val="18"/>
               </w:rPr>
-              <w:t>ó</w:t>
-            </w:r>
-            <w:r>
-              <w:rPr>
-                <w:sz w:val="18"/>
-                <w:szCs w:val="18"/>
-              </w:rPr>
-              <w:t>n de plazo</w:t>
+            </w:r>
+            <w:r>
+              <w:rPr>
+                <w:sz w:val="18"/>
+                <w:szCs w:val="18"/>
+              </w:rPr>
             </w:r>
           </w:p>
         </w:tc>
@@ -831,7 +835,7 @@
                 <w:sz w:val="18"/>
                 <w:szCs w:val="18"/>
               </w:rPr>
-              <w:t>Kruskal-Wallis (significativo) y Mann-Whitney U</w:t>
+              <w:t>Kruskal-Wallis y Mann-Whitney U, p &lt; 0.001</w:t>
             </w:r>
           </w:p>
         </w:tc>
@@ -857,7 +861,7 @@
                 <w:sz w:val="18"/>
                 <w:szCs w:val="18"/>
               </w:rPr>
-              <w:t>eta² = 0.022 (global débil)</w:t>
+              <w:t>eta² = 0.0168 (débil)</w:t>
             </w:r>
           </w:p>
         </w:tc>
@@ -883,7 +887,7 @@
                 <w:sz w:val="18"/>
                 <w:szCs w:val="18"/>
               </w:rPr>
-              <w:t>Licitación pública: +15.72 días frente a Mínima cuantía (supera umbral de 15 días)</w:t>
+              <w:t>Licitación pública: +13.31 días frente a Mínima cuantía, bajo el umbral de 15 días</w:t>
             </w:r>
           </w:p>
         </w:tc>
@@ -921,7 +925,7 @@
                 <w:sz w:val="18"/>
                 <w:szCs w:val="18"/>
               </w:rPr>
-              <w:t>3.2 Modalidad - no ejecutado</w:t>
+              <w:t>3.1 Modalidad - frecuencia de adición</w:t>
             </w:r>
             <w:r>
               <w:rPr>
@@ -960,7 +964,7 @@
                 <w:sz w:val="18"/>
                 <w:szCs w:val="18"/>
               </w:rPr>
-              <w:t>Chi-cuadrado, chi2 = 1703.39, df = 8, p = 0.0</w:t>
+              <w:t>Chi-cuadrado, chi2 = 2261.51, df = 8, p &lt; 0.001</w:t>
             </w:r>
           </w:p>
         </w:tc>
@@ -987,7 +991,7 @@
                 <w:sz w:val="18"/>
                 <w:szCs w:val="18"/>
               </w:rPr>
-              <w:t>Cramér's V = 0.0931 (despreciable)</w:t>
+              <w:t>Cramér's V = 0.1272 (débil)</w:t>
             </w:r>
           </w:p>
         </w:tc>
@@ -1014,7 +1018,7 @@
                 <w:sz w:val="18"/>
                 <w:szCs w:val="18"/>
               </w:rPr>
-              <w:t>Contratación régimen especial (con ofertas): 38.64% frente a ~20% del resto (brecha de 18.5 puntos)</w:t>
+              <w:t>Licitación pública: 23.71% de contratos con adición frente a 6.13% en Mínima cuantía</w:t>
             </w:r>
           </w:p>
         </w:tc>
@@ -1051,7 +1055,7 @@
                 <w:sz w:val="18"/>
                 <w:szCs w:val="18"/>
               </w:rPr>
-              <w:t>3.3 Modalidad - sin liquidar</w:t>
+              <w:t>3.2 Modalidad - no ejecutado</w:t>
             </w:r>
             <w:r>
               <w:rPr>
@@ -1089,7 +1093,7 @@
                 <w:sz w:val="18"/>
                 <w:szCs w:val="18"/>
               </w:rPr>
-              <w:t>Chi-cuadrado, chi2 = 3087.58, df = 8, p = 0.0</w:t>
+              <w:t>Chi-cuadrado, chi2 = 3326.39, df = 8, p &lt; 0.001</w:t>
             </w:r>
           </w:p>
         </w:tc>
@@ -1115,7 +1119,7 @@
                 <w:sz w:val="18"/>
                 <w:szCs w:val="18"/>
               </w:rPr>
-              <w:t>Cramér's V = 0.1748 (débil-moderado)</w:t>
+              <w:t>Cramér's V = 0.2066 (débil-moderado)</w:t>
             </w:r>
           </w:p>
         </w:tc>
@@ -1141,7 +1145,7 @@
                 <w:sz w:val="18"/>
                 <w:szCs w:val="18"/>
               </w:rPr>
-              <w:t>Contratación régimen especial (con ofertas): 81.74% y Contratación régimen especial: 72.14% frente a 55.31% promedio</w:t>
+              <w:t>Contratación régimen especial (con ofertas): 82.97% frente a 42.54% general</w:t>
             </w:r>
           </w:p>
         </w:tc>
@@ -1179,7 +1183,7 @@
                 <w:sz w:val="18"/>
                 <w:szCs w:val="18"/>
               </w:rPr>
-              <w:t>3.7 Valor del contrato - sin liquidar</w:t>
+              <w:t>3.3 Modalidad - sin liquidar</w:t>
             </w:r>
             <w:r>
               <w:rPr>
@@ -1218,7 +1222,7 @@
                 <w:sz w:val="18"/>
                 <w:szCs w:val="18"/>
               </w:rPr>
-              <w:t>Mann-Whitney U, p = 0.0</w:t>
+              <w:t>Chi-cuadrado, chi2 = 2327.42, df = 8, p &lt; 0.001</w:t>
             </w:r>
           </w:p>
         </w:tc>
@@ -1245,7 +1249,7 @@
                 <w:sz w:val="18"/>
                 <w:szCs w:val="18"/>
               </w:rPr>
-              <w:t>Rank-biserial = -0.1554 (débil)</w:t>
+              <w:t>Cramér's V = 0.1728 (débil)</w:t>
             </w:r>
           </w:p>
         </w:tc>
@@ -1272,7 +1276,7 @@
                 <w:sz w:val="18"/>
                 <w:szCs w:val="18"/>
               </w:rPr>
-              <w:t>Diferencia relativa de medianas de 28.71%, justo debajo del umbral de 30%</w:t>
+              <w:t>Régimen especial (con ofertas) 83.94% y régimen especial 72.16% frente a 57.40% promedio</w:t>
             </w:r>
           </w:p>
         </w:tc>
@@ -1309,21 +1313,19 @@
                 <w:sz w:val="18"/>
                 <w:szCs w:val="18"/>
               </w:rPr>
-              <w:t xml:space="preserve">3.8 Destino del gasto </w:t>
-            </w:r>
-            <w:r>
-              <w:rPr>
-                <w:sz w:val="18"/>
-                <w:szCs w:val="18"/>
-              </w:rPr>
-              <w:t xml:space="preserve">- </w:t>
-            </w:r>
-            <w:r>
-              <w:rPr>
-                <w:sz w:val="18"/>
-                <w:szCs w:val="18"/>
-              </w:rPr>
-              <w:t>no ejecutado</w:t>
+              <w:t>3.6 Valor dentro de cada modalidad - sin liquidar</w:t>
+            </w:r>
+            <w:r>
+              <w:rPr>
+                <w:sz w:val="18"/>
+                <w:szCs w:val="18"/>
+              </w:rPr>
+            </w:r>
+            <w:r>
+              <w:rPr>
+                <w:sz w:val="18"/>
+                <w:szCs w:val="18"/>
+              </w:rPr>
             </w:r>
           </w:p>
         </w:tc>
@@ -1349,7 +1351,7 @@
                 <w:sz w:val="18"/>
                 <w:szCs w:val="18"/>
               </w:rPr>
-              <w:t>Chi-cuadrado, chi2 = 2500.30, df = 3, p = 0.0</w:t>
+              <w:t>9 pruebas Mann-Whitney U, corrección de Bonferroni (α = 0.0056)</w:t>
             </w:r>
           </w:p>
         </w:tc>
@@ -1375,7 +1377,7 @@
                 <w:sz w:val="18"/>
                 <w:szCs w:val="18"/>
               </w:rPr>
-              <w:t>Cramér's V = 0.1128 (débil)</w:t>
+              <w:t>Rank-biserial entre -0.17 y 0.13 (débil)</w:t>
             </w:r>
           </w:p>
         </w:tc>
@@ -1401,7 +1403,7 @@
                 <w:sz w:val="18"/>
                 <w:szCs w:val="18"/>
               </w:rPr>
-              <w:t>Brecha real (Funcionamiento vs Inversión) de 8.97 puntos, bajo el umbral. Registros sin definir con no ejecución más alta</w:t>
+              <w:t>Significativa en 8 de 9. Licitación pública: los sin liquidar son de mayor valor (p = 0.0009). Selección Abreviada Sin Manifestación de Interés: no significativa (p = 0.83)</w:t>
             </w:r>
           </w:p>
         </w:tc>
@@ -1439,7 +1441,7 @@
                 <w:sz w:val="18"/>
                 <w:szCs w:val="18"/>
               </w:rPr>
-              <w:t xml:space="preserve">3.9 Sector </w:t>
+              <w:t>3.7 Valor del contrato - sin liquidar</w:t>
             </w:r>
             <w:r>
               <w:rPr>
@@ -1447,14 +1449,12 @@
                 <w:sz w:val="18"/>
                 <w:szCs w:val="18"/>
               </w:rPr>
-              <w:t>-</w:t>
-            </w:r>
-            <w:r>
-              <w:rPr>
-                <w:sz w:val="18"/>
-                <w:szCs w:val="18"/>
-              </w:rPr>
-              <w:t xml:space="preserve"> sin liquidar</w:t>
+            </w:r>
+            <w:r>
+              <w:rPr>
+                <w:sz w:val="18"/>
+                <w:szCs w:val="18"/>
+              </w:rPr>
             </w:r>
           </w:p>
         </w:tc>
@@ -1481,7 +1481,7 @@
                 <w:sz w:val="18"/>
                 <w:szCs w:val="18"/>
               </w:rPr>
-              <w:t>Chi-cuadrado, chi2 = 8008.96, df = 24, p = 0.0</w:t>
+              <w:t>Mann-Whitney U, p &lt; 0.001</w:t>
             </w:r>
           </w:p>
         </w:tc>
@@ -1508,7 +1508,7 @@
                 <w:sz w:val="18"/>
                 <w:szCs w:val="18"/>
               </w:rPr>
-              <w:t>Cramér's V = 0.2815 (el más fuerte de todos)</w:t>
+              <w:t>Rank-biserial = -0.1480 (débil)</w:t>
             </w:r>
           </w:p>
         </w:tc>
@@ -1535,7 +1535,667 @@
                 <w:sz w:val="18"/>
                 <w:szCs w:val="18"/>
               </w:rPr>
-              <w:t>Ley de Justicia (71.35%) y Salud y Protección Social (70.67%) como focos de alto volumen</w:t>
+              <w:t>Diferencia relativa de medianas de 29.63%, justo debajo del umbral de 30%</w:t>
+            </w:r>
+          </w:p>
+        </w:tc>
+      </w:tr>
+      <w:tr>
+        <w:tblPrEx>
+          <w:tblCellMar>
+            <w:top w:w="0" w:type="dxa"/>
+            <w:bottom w:w="0" w:type="dxa"/>
+          </w:tblCellMar>
+        </w:tblPrEx>
+        <w:trPr>
+          <w:cantSplit/>
+        </w:trPr>
+        <w:tc>
+          <w:tcPr>
+            <w:tcW w:w="2200" w:type="dxa"/>
+            <w:tcBorders>
+              <w:top w:val="single" w:sz="2" w:space="0" w:color="BFBFBF"/>
+              <w:left w:val="single" w:sz="2" w:space="0" w:color="BFBFBF"/>
+              <w:bottom w:val="single" w:sz="2" w:space="0" w:color="BFBFBF"/>
+              <w:right w:val="single" w:sz="2" w:space="0" w:color="BFBFBF"/>
+            </w:tcBorders>
+            <w:shd w:val="clear" w:color="auto" w:fill="F2F2F2"/>
+            <w:tcMar>
+              <w:top w:w="60" w:type="dxa"/>
+              <w:left w:w="100" w:type="dxa"/>
+              <w:bottom w:w="60" w:type="dxa"/>
+              <w:right w:w="100" w:type="dxa"/>
+            </w:tcMar>
+          </w:tcPr>
+          <w:p>
+            <w:r>
+              <w:rPr>
+                <w:sz w:val="18"/>
+                <w:szCs w:val="18"/>
+              </w:rPr>
+              <w:t>3.8 Destino del gasto - no ejecutado</w:t>
+            </w:r>
+            <w:r>
+              <w:rPr>
+                <w:rFonts w:ascii="Arial" w:hAnsi="Arial" w:cs="Arial"/>
+                <w:sz w:val="18"/>
+                <w:szCs w:val="18"/>
+              </w:rPr>
+            </w:r>
+            <w:r>
+              <w:rPr>
+                <w:sz w:val="18"/>
+                <w:szCs w:val="18"/>
+              </w:rPr>
+            </w:r>
+          </w:p>
+        </w:tc>
+        <w:tc>
+          <w:tcPr>
+            <w:tcW w:w="2350" w:type="dxa"/>
+            <w:tcBorders>
+              <w:top w:val="single" w:sz="2" w:space="0" w:color="BFBFBF"/>
+              <w:left w:val="single" w:sz="2" w:space="0" w:color="BFBFBF"/>
+              <w:bottom w:val="single" w:sz="2" w:space="0" w:color="BFBFBF"/>
+              <w:right w:val="single" w:sz="2" w:space="0" w:color="BFBFBF"/>
+            </w:tcBorders>
+            <w:shd w:val="clear" w:color="auto" w:fill="F2F2F2"/>
+            <w:tcMar>
+              <w:top w:w="60" w:type="dxa"/>
+              <w:left w:w="100" w:type="dxa"/>
+              <w:bottom w:w="60" w:type="dxa"/>
+              <w:right w:w="100" w:type="dxa"/>
+            </w:tcMar>
+          </w:tcPr>
+          <w:p>
+            <w:r>
+              <w:rPr>
+                <w:sz w:val="18"/>
+                <w:szCs w:val="18"/>
+              </w:rPr>
+              <w:t>Chi-cuadrado, chi2 = 1999.52, df = 2, p &lt; 0.001</w:t>
+            </w:r>
+          </w:p>
+        </w:tc>
+        <w:tc>
+          <w:tcPr>
+            <w:tcW w:w="1550" w:type="dxa"/>
+            <w:tcBorders>
+              <w:top w:val="single" w:sz="2" w:space="0" w:color="BFBFBF"/>
+              <w:left w:val="single" w:sz="2" w:space="0" w:color="BFBFBF"/>
+              <w:bottom w:val="single" w:sz="2" w:space="0" w:color="BFBFBF"/>
+              <w:right w:val="single" w:sz="2" w:space="0" w:color="BFBFBF"/>
+            </w:tcBorders>
+            <w:shd w:val="clear" w:color="auto" w:fill="F2F2F2"/>
+            <w:tcMar>
+              <w:top w:w="60" w:type="dxa"/>
+              <w:left w:w="100" w:type="dxa"/>
+              <w:bottom w:w="60" w:type="dxa"/>
+              <w:right w:w="100" w:type="dxa"/>
+            </w:tcMar>
+          </w:tcPr>
+          <w:p>
+            <w:r>
+              <w:rPr>
+                <w:sz w:val="18"/>
+                <w:szCs w:val="18"/>
+              </w:rPr>
+              <w:t>Cramér's V = 0.1602 (débil)</w:t>
+            </w:r>
+          </w:p>
+        </w:tc>
+        <w:tc>
+          <w:tcPr>
+            <w:tcW w:w="2900" w:type="dxa"/>
+            <w:tcBorders>
+              <w:top w:val="single" w:sz="2" w:space="0" w:color="BFBFBF"/>
+              <w:left w:val="single" w:sz="2" w:space="0" w:color="BFBFBF"/>
+              <w:bottom w:val="single" w:sz="2" w:space="0" w:color="BFBFBF"/>
+              <w:right w:val="single" w:sz="2" w:space="0" w:color="BFBFBF"/>
+            </w:tcBorders>
+            <w:shd w:val="clear" w:color="auto" w:fill="F2F2F2"/>
+            <w:tcMar>
+              <w:top w:w="60" w:type="dxa"/>
+              <w:left w:w="100" w:type="dxa"/>
+              <w:bottom w:w="60" w:type="dxa"/>
+              <w:right w:w="100" w:type="dxa"/>
+            </w:tcMar>
+          </w:tcPr>
+          <w:p>
+            <w:r>
+              <w:rPr>
+                <w:sz w:val="18"/>
+                <w:szCs w:val="18"/>
+              </w:rPr>
+              <w:t>Funcionamiento 48.88% frente a Inversión 32.65%, brecha de 16.23 puntos</w:t>
+            </w:r>
+          </w:p>
+        </w:tc>
+      </w:tr>
+      <w:tr>
+        <w:tblPrEx>
+          <w:tblCellMar>
+            <w:top w:w="0" w:type="dxa"/>
+            <w:bottom w:w="0" w:type="dxa"/>
+          </w:tblCellMar>
+        </w:tblPrEx>
+        <w:trPr>
+          <w:cantSplit/>
+        </w:trPr>
+        <w:tc>
+          <w:tcPr>
+            <w:tcW w:w="2200" w:type="dxa"/>
+            <w:tcBorders>
+              <w:top w:val="single" w:sz="2" w:space="0" w:color="BFBFBF"/>
+              <w:left w:val="single" w:sz="2" w:space="0" w:color="BFBFBF"/>
+              <w:bottom w:val="single" w:sz="2" w:space="0" w:color="BFBFBF"/>
+              <w:right w:val="single" w:sz="2" w:space="0" w:color="BFBFBF"/>
+            </w:tcBorders>
+            <w:shd w:val="clear" w:color="auto" w:fill="F2F2F2"/>
+            <w:tcMar>
+              <w:top w:w="60" w:type="dxa"/>
+              <w:left w:w="100" w:type="dxa"/>
+              <w:bottom w:w="60" w:type="dxa"/>
+              <w:right w:w="100" w:type="dxa"/>
+            </w:tcMar>
+          </w:tcPr>
+          <w:p>
+            <w:r>
+              <w:rPr>
+                <w:sz w:val="18"/>
+                <w:szCs w:val="18"/>
+              </w:rPr>
+              <w:t>3.9 Sector - sin liquidar</w:t>
+            </w:r>
+            <w:r>
+              <w:rPr>
+                <w:rFonts w:ascii="Arial" w:hAnsi="Arial" w:cs="Arial"/>
+                <w:sz w:val="18"/>
+                <w:szCs w:val="18"/>
+              </w:rPr>
+            </w:r>
+            <w:r>
+              <w:rPr>
+                <w:sz w:val="18"/>
+                <w:szCs w:val="18"/>
+              </w:rPr>
+            </w:r>
+          </w:p>
+        </w:tc>
+        <w:tc>
+          <w:tcPr>
+            <w:tcW w:w="2350" w:type="dxa"/>
+            <w:tcBorders>
+              <w:top w:val="single" w:sz="2" w:space="0" w:color="BFBFBF"/>
+              <w:left w:val="single" w:sz="2" w:space="0" w:color="BFBFBF"/>
+              <w:bottom w:val="single" w:sz="2" w:space="0" w:color="BFBFBF"/>
+              <w:right w:val="single" w:sz="2" w:space="0" w:color="BFBFBF"/>
+            </w:tcBorders>
+            <w:shd w:val="clear" w:color="auto" w:fill="F2F2F2"/>
+            <w:tcMar>
+              <w:top w:w="60" w:type="dxa"/>
+              <w:left w:w="100" w:type="dxa"/>
+              <w:bottom w:w="60" w:type="dxa"/>
+              <w:right w:w="100" w:type="dxa"/>
+            </w:tcMar>
+          </w:tcPr>
+          <w:p>
+            <w:r>
+              <w:rPr>
+                <w:sz w:val="18"/>
+                <w:szCs w:val="18"/>
+              </w:rPr>
+              <w:t>Chi-cuadrado, chi2 = 6731.43, df = 24, p &lt; 0.001</w:t>
+            </w:r>
+          </w:p>
+        </w:tc>
+        <w:tc>
+          <w:tcPr>
+            <w:tcW w:w="1550" w:type="dxa"/>
+            <w:tcBorders>
+              <w:top w:val="single" w:sz="2" w:space="0" w:color="BFBFBF"/>
+              <w:left w:val="single" w:sz="2" w:space="0" w:color="BFBFBF"/>
+              <w:bottom w:val="single" w:sz="2" w:space="0" w:color="BFBFBF"/>
+              <w:right w:val="single" w:sz="2" w:space="0" w:color="BFBFBF"/>
+            </w:tcBorders>
+            <w:shd w:val="clear" w:color="auto" w:fill="F2F2F2"/>
+            <w:tcMar>
+              <w:top w:w="60" w:type="dxa"/>
+              <w:left w:w="100" w:type="dxa"/>
+              <w:bottom w:w="60" w:type="dxa"/>
+              <w:right w:w="100" w:type="dxa"/>
+            </w:tcMar>
+          </w:tcPr>
+          <w:p>
+            <w:r>
+              <w:rPr>
+                <w:sz w:val="18"/>
+                <w:szCs w:val="18"/>
+              </w:rPr>
+              <w:t>Cramér's V = 0.2939 (el más fuerte)</w:t>
+            </w:r>
+          </w:p>
+        </w:tc>
+        <w:tc>
+          <w:tcPr>
+            <w:tcW w:w="2900" w:type="dxa"/>
+            <w:tcBorders>
+              <w:top w:val="single" w:sz="2" w:space="0" w:color="BFBFBF"/>
+              <w:left w:val="single" w:sz="2" w:space="0" w:color="BFBFBF"/>
+              <w:bottom w:val="single" w:sz="2" w:space="0" w:color="BFBFBF"/>
+              <w:right w:val="single" w:sz="2" w:space="0" w:color="BFBFBF"/>
+            </w:tcBorders>
+            <w:shd w:val="clear" w:color="auto" w:fill="F2F2F2"/>
+            <w:tcMar>
+              <w:top w:w="60" w:type="dxa"/>
+              <w:left w:w="100" w:type="dxa"/>
+              <w:bottom w:w="60" w:type="dxa"/>
+              <w:right w:w="100" w:type="dxa"/>
+            </w:tcMar>
+          </w:tcPr>
+          <w:p>
+            <w:r>
+              <w:rPr>
+                <w:sz w:val="18"/>
+                <w:szCs w:val="18"/>
+              </w:rPr>
+              <w:t>Salud (73.36%), Ley de Justicia (70.73%) y Educación Nacional (68.42%) como sectores de alto volumen y alta tasa</w:t>
+            </w:r>
+          </w:p>
+        </w:tc>
+      </w:tr>
+      <w:tr>
+        <w:tblPrEx>
+          <w:tblCellMar>
+            <w:top w:w="0" w:type="dxa"/>
+            <w:bottom w:w="0" w:type="dxa"/>
+          </w:tblCellMar>
+        </w:tblPrEx>
+        <w:trPr>
+          <w:cantSplit/>
+        </w:trPr>
+        <w:tc>
+          <w:tcPr>
+            <w:tcW w:w="2200" w:type="dxa"/>
+            <w:tcBorders>
+              <w:top w:val="single" w:sz="2" w:space="0" w:color="BFBFBF"/>
+              <w:left w:val="single" w:sz="2" w:space="0" w:color="BFBFBF"/>
+              <w:bottom w:val="single" w:sz="2" w:space="0" w:color="BFBFBF"/>
+              <w:right w:val="single" w:sz="2" w:space="0" w:color="BFBFBF"/>
+            </w:tcBorders>
+            <w:shd w:val="clear" w:color="auto" w:fill="F2F2F2"/>
+            <w:tcMar>
+              <w:top w:w="60" w:type="dxa"/>
+              <w:left w:w="100" w:type="dxa"/>
+              <w:bottom w:w="60" w:type="dxa"/>
+              <w:right w:w="100" w:type="dxa"/>
+            </w:tcMar>
+          </w:tcPr>
+          <w:p>
+            <w:r>
+              <w:rPr>
+                <w:sz w:val="18"/>
+                <w:szCs w:val="18"/>
+              </w:rPr>
+              <w:t>3.11 Orden de la entidad - sin liquidar</w:t>
+            </w:r>
+            <w:r>
+              <w:rPr>
+                <w:rFonts w:ascii="Arial" w:hAnsi="Arial" w:cs="Arial"/>
+                <w:sz w:val="18"/>
+                <w:szCs w:val="18"/>
+              </w:rPr>
+            </w:r>
+            <w:r>
+              <w:rPr>
+                <w:sz w:val="18"/>
+                <w:szCs w:val="18"/>
+              </w:rPr>
+            </w:r>
+          </w:p>
+        </w:tc>
+        <w:tc>
+          <w:tcPr>
+            <w:tcW w:w="2350" w:type="dxa"/>
+            <w:tcBorders>
+              <w:top w:val="single" w:sz="2" w:space="0" w:color="BFBFBF"/>
+              <w:left w:val="single" w:sz="2" w:space="0" w:color="BFBFBF"/>
+              <w:bottom w:val="single" w:sz="2" w:space="0" w:color="BFBFBF"/>
+              <w:right w:val="single" w:sz="2" w:space="0" w:color="BFBFBF"/>
+            </w:tcBorders>
+            <w:shd w:val="clear" w:color="auto" w:fill="F2F2F2"/>
+            <w:tcMar>
+              <w:top w:w="60" w:type="dxa"/>
+              <w:left w:w="100" w:type="dxa"/>
+              <w:bottom w:w="60" w:type="dxa"/>
+              <w:right w:w="100" w:type="dxa"/>
+            </w:tcMar>
+          </w:tcPr>
+          <w:p>
+            <w:r>
+              <w:rPr>
+                <w:sz w:val="18"/>
+                <w:szCs w:val="18"/>
+              </w:rPr>
+              <w:t>Chi-cuadrado, chi2 = 1084.16, df = 2, p &lt; 0.001</w:t>
+            </w:r>
+          </w:p>
+        </w:tc>
+        <w:tc>
+          <w:tcPr>
+            <w:tcW w:w="1550" w:type="dxa"/>
+            <w:tcBorders>
+              <w:top w:val="single" w:sz="2" w:space="0" w:color="BFBFBF"/>
+              <w:left w:val="single" w:sz="2" w:space="0" w:color="BFBFBF"/>
+              <w:bottom w:val="single" w:sz="2" w:space="0" w:color="BFBFBF"/>
+              <w:right w:val="single" w:sz="2" w:space="0" w:color="BFBFBF"/>
+            </w:tcBorders>
+            <w:shd w:val="clear" w:color="auto" w:fill="F2F2F2"/>
+            <w:tcMar>
+              <w:top w:w="60" w:type="dxa"/>
+              <w:left w:w="100" w:type="dxa"/>
+              <w:bottom w:w="60" w:type="dxa"/>
+              <w:right w:w="100" w:type="dxa"/>
+            </w:tcMar>
+          </w:tcPr>
+          <w:p>
+            <w:r>
+              <w:rPr>
+                <w:sz w:val="18"/>
+                <w:szCs w:val="18"/>
+              </w:rPr>
+              <w:t>Cramér's V = 0.1180 (débil)</w:t>
+            </w:r>
+          </w:p>
+        </w:tc>
+        <w:tc>
+          <w:tcPr>
+            <w:tcW w:w="2900" w:type="dxa"/>
+            <w:tcBorders>
+              <w:top w:val="single" w:sz="2" w:space="0" w:color="BFBFBF"/>
+              <w:left w:val="single" w:sz="2" w:space="0" w:color="BFBFBF"/>
+              <w:bottom w:val="single" w:sz="2" w:space="0" w:color="BFBFBF"/>
+              <w:right w:val="single" w:sz="2" w:space="0" w:color="BFBFBF"/>
+            </w:tcBorders>
+            <w:shd w:val="clear" w:color="auto" w:fill="F2F2F2"/>
+            <w:tcMar>
+              <w:top w:w="60" w:type="dxa"/>
+              <w:left w:w="100" w:type="dxa"/>
+              <w:bottom w:w="60" w:type="dxa"/>
+              <w:right w:w="100" w:type="dxa"/>
+            </w:tcMar>
+          </w:tcPr>
+          <w:p>
+            <w:r>
+              <w:rPr>
+                <w:sz w:val="18"/>
+                <w:szCs w:val="18"/>
+              </w:rPr>
+              <w:t>Territorial 63.74% frente a Nacional 52.07%, brecha de 11.67 puntos</w:t>
+            </w:r>
+          </w:p>
+        </w:tc>
+      </w:tr>
+      <w:tr>
+        <w:tblPrEx>
+          <w:tblCellMar>
+            <w:top w:w="0" w:type="dxa"/>
+            <w:bottom w:w="0" w:type="dxa"/>
+          </w:tblCellMar>
+        </w:tblPrEx>
+        <w:trPr>
+          <w:cantSplit/>
+        </w:trPr>
+        <w:tc>
+          <w:tcPr>
+            <w:tcW w:w="2200" w:type="dxa"/>
+            <w:tcBorders>
+              <w:top w:val="single" w:sz="2" w:space="0" w:color="BFBFBF"/>
+              <w:left w:val="single" w:sz="2" w:space="0" w:color="BFBFBF"/>
+              <w:bottom w:val="single" w:sz="2" w:space="0" w:color="BFBFBF"/>
+              <w:right w:val="single" w:sz="2" w:space="0" w:color="BFBFBF"/>
+            </w:tcBorders>
+            <w:shd w:val="clear" w:color="auto" w:fill="F2F2F2"/>
+            <w:tcMar>
+              <w:top w:w="60" w:type="dxa"/>
+              <w:left w:w="100" w:type="dxa"/>
+              <w:bottom w:w="60" w:type="dxa"/>
+              <w:right w:w="100" w:type="dxa"/>
+            </w:tcMar>
+          </w:tcPr>
+          <w:p>
+            <w:r>
+              <w:rPr>
+                <w:sz w:val="18"/>
+                <w:szCs w:val="18"/>
+              </w:rPr>
+              <w:t>3.11 Entidad centralizada - sin liquidar</w:t>
+            </w:r>
+            <w:r>
+              <w:rPr>
+                <w:rFonts w:ascii="Arial" w:hAnsi="Arial" w:cs="Arial"/>
+                <w:sz w:val="18"/>
+                <w:szCs w:val="18"/>
+              </w:rPr>
+            </w:r>
+            <w:r>
+              <w:rPr>
+                <w:sz w:val="18"/>
+                <w:szCs w:val="18"/>
+              </w:rPr>
+            </w:r>
+          </w:p>
+        </w:tc>
+        <w:tc>
+          <w:tcPr>
+            <w:tcW w:w="2350" w:type="dxa"/>
+            <w:tcBorders>
+              <w:top w:val="single" w:sz="2" w:space="0" w:color="BFBFBF"/>
+              <w:left w:val="single" w:sz="2" w:space="0" w:color="BFBFBF"/>
+              <w:bottom w:val="single" w:sz="2" w:space="0" w:color="BFBFBF"/>
+              <w:right w:val="single" w:sz="2" w:space="0" w:color="BFBFBF"/>
+            </w:tcBorders>
+            <w:shd w:val="clear" w:color="auto" w:fill="F2F2F2"/>
+            <w:tcMar>
+              <w:top w:w="60" w:type="dxa"/>
+              <w:left w:w="100" w:type="dxa"/>
+              <w:bottom w:w="60" w:type="dxa"/>
+              <w:right w:w="100" w:type="dxa"/>
+            </w:tcMar>
+          </w:tcPr>
+          <w:p>
+            <w:r>
+              <w:rPr>
+                <w:sz w:val="18"/>
+                <w:szCs w:val="18"/>
+              </w:rPr>
+              <w:t>Chi-cuadrado, chi2 = 99.48, df = 1, p &lt; 0.001</w:t>
+            </w:r>
+          </w:p>
+        </w:tc>
+        <w:tc>
+          <w:tcPr>
+            <w:tcW w:w="1550" w:type="dxa"/>
+            <w:tcBorders>
+              <w:top w:val="single" w:sz="2" w:space="0" w:color="BFBFBF"/>
+              <w:left w:val="single" w:sz="2" w:space="0" w:color="BFBFBF"/>
+              <w:bottom w:val="single" w:sz="2" w:space="0" w:color="BFBFBF"/>
+              <w:right w:val="single" w:sz="2" w:space="0" w:color="BFBFBF"/>
+            </w:tcBorders>
+            <w:shd w:val="clear" w:color="auto" w:fill="F2F2F2"/>
+            <w:tcMar>
+              <w:top w:w="60" w:type="dxa"/>
+              <w:left w:w="100" w:type="dxa"/>
+              <w:bottom w:w="60" w:type="dxa"/>
+              <w:right w:w="100" w:type="dxa"/>
+            </w:tcMar>
+          </w:tcPr>
+          <w:p>
+            <w:r>
+              <w:rPr>
+                <w:sz w:val="18"/>
+                <w:szCs w:val="18"/>
+              </w:rPr>
+              <w:t>Cramér's V = 0.0357 (despreciable)</w:t>
+            </w:r>
+          </w:p>
+        </w:tc>
+        <w:tc>
+          <w:tcPr>
+            <w:tcW w:w="2900" w:type="dxa"/>
+            <w:tcBorders>
+              <w:top w:val="single" w:sz="2" w:space="0" w:color="BFBFBF"/>
+              <w:left w:val="single" w:sz="2" w:space="0" w:color="BFBFBF"/>
+              <w:bottom w:val="single" w:sz="2" w:space="0" w:color="BFBFBF"/>
+              <w:right w:val="single" w:sz="2" w:space="0" w:color="BFBFBF"/>
+            </w:tcBorders>
+            <w:shd w:val="clear" w:color="auto" w:fill="F2F2F2"/>
+            <w:tcMar>
+              <w:top w:w="60" w:type="dxa"/>
+              <w:left w:w="100" w:type="dxa"/>
+              <w:bottom w:w="60" w:type="dxa"/>
+              <w:right w:w="100" w:type="dxa"/>
+            </w:tcMar>
+          </w:tcPr>
+          <w:p>
+            <w:r>
+              <w:rPr>
+                <w:sz w:val="18"/>
+                <w:szCs w:val="18"/>
+              </w:rPr>
+              <w:t>Brecha de 4.23 puntos, bajo el umbral: no es un criterio útil</w:t>
+            </w:r>
+          </w:p>
+        </w:tc>
+      </w:tr>
+      <w:tr>
+        <w:tblPrEx>
+          <w:tblCellMar>
+            <w:top w:w="0" w:type="dxa"/>
+            <w:bottom w:w="0" w:type="dxa"/>
+          </w:tblCellMar>
+        </w:tblPrEx>
+        <w:trPr>
+          <w:cantSplit/>
+        </w:trPr>
+        <w:tc>
+          <w:tcPr>
+            <w:tcW w:w="2200" w:type="dxa"/>
+            <w:tcBorders>
+              <w:top w:val="single" w:sz="2" w:space="0" w:color="BFBFBF"/>
+              <w:left w:val="single" w:sz="2" w:space="0" w:color="BFBFBF"/>
+              <w:bottom w:val="single" w:sz="2" w:space="0" w:color="BFBFBF"/>
+              <w:right w:val="single" w:sz="2" w:space="0" w:color="BFBFBF"/>
+            </w:tcBorders>
+            <w:shd w:val="clear" w:color="auto" w:fill="F2F2F2"/>
+            <w:tcMar>
+              <w:top w:w="60" w:type="dxa"/>
+              <w:left w:w="100" w:type="dxa"/>
+              <w:bottom w:w="60" w:type="dxa"/>
+              <w:right w:w="100" w:type="dxa"/>
+            </w:tcMar>
+          </w:tcPr>
+          <w:p>
+            <w:r>
+              <w:rPr>
+                <w:sz w:val="18"/>
+                <w:szCs w:val="18"/>
+              </w:rPr>
+              <w:t>3.12 Salud y régimen especial - sin liquidar</w:t>
+            </w:r>
+            <w:r>
+              <w:rPr>
+                <w:rFonts w:ascii="Arial" w:hAnsi="Arial" w:cs="Arial"/>
+                <w:sz w:val="18"/>
+                <w:szCs w:val="18"/>
+              </w:rPr>
+            </w:r>
+            <w:r>
+              <w:rPr>
+                <w:sz w:val="18"/>
+                <w:szCs w:val="18"/>
+              </w:rPr>
+            </w:r>
+          </w:p>
+        </w:tc>
+        <w:tc>
+          <w:tcPr>
+            <w:tcW w:w="2350" w:type="dxa"/>
+            <w:tcBorders>
+              <w:top w:val="single" w:sz="2" w:space="0" w:color="BFBFBF"/>
+              <w:left w:val="single" w:sz="2" w:space="0" w:color="BFBFBF"/>
+              <w:bottom w:val="single" w:sz="2" w:space="0" w:color="BFBFBF"/>
+              <w:right w:val="single" w:sz="2" w:space="0" w:color="BFBFBF"/>
+            </w:tcBorders>
+            <w:shd w:val="clear" w:color="auto" w:fill="F2F2F2"/>
+            <w:tcMar>
+              <w:top w:w="60" w:type="dxa"/>
+              <w:left w:w="100" w:type="dxa"/>
+              <w:bottom w:w="60" w:type="dxa"/>
+              <w:right w:w="100" w:type="dxa"/>
+            </w:tcMar>
+          </w:tcPr>
+          <w:p>
+            <w:r>
+              <w:rPr>
+                <w:sz w:val="18"/>
+                <w:szCs w:val="18"/>
+              </w:rPr>
+              <w:t>Chi-cuadrado estratificado</w:t>
+            </w:r>
+          </w:p>
+        </w:tc>
+        <w:tc>
+          <w:tcPr>
+            <w:tcW w:w="1550" w:type="dxa"/>
+            <w:tcBorders>
+              <w:top w:val="single" w:sz="2" w:space="0" w:color="BFBFBF"/>
+              <w:left w:val="single" w:sz="2" w:space="0" w:color="BFBFBF"/>
+              <w:bottom w:val="single" w:sz="2" w:space="0" w:color="BFBFBF"/>
+              <w:right w:val="single" w:sz="2" w:space="0" w:color="BFBFBF"/>
+            </w:tcBorders>
+            <w:shd w:val="clear" w:color="auto" w:fill="F2F2F2"/>
+            <w:tcMar>
+              <w:top w:w="60" w:type="dxa"/>
+              <w:left w:w="100" w:type="dxa"/>
+              <w:bottom w:w="60" w:type="dxa"/>
+              <w:right w:w="100" w:type="dxa"/>
+            </w:tcMar>
+          </w:tcPr>
+          <w:p>
+            <w:r>
+              <w:rPr>
+                <w:sz w:val="18"/>
+                <w:szCs w:val="18"/>
+              </w:rPr>
+              <w:t>Cramér's V entre 0.04 y 0.13</w:t>
+            </w:r>
+          </w:p>
+        </w:tc>
+        <w:tc>
+          <w:tcPr>
+            <w:tcW w:w="2900" w:type="dxa"/>
+            <w:tcBorders>
+              <w:top w:val="single" w:sz="2" w:space="0" w:color="BFBFBF"/>
+              <w:left w:val="single" w:sz="2" w:space="0" w:color="BFBFBF"/>
+              <w:bottom w:val="single" w:sz="2" w:space="0" w:color="BFBFBF"/>
+              <w:right w:val="single" w:sz="2" w:space="0" w:color="BFBFBF"/>
+            </w:tcBorders>
+            <w:shd w:val="clear" w:color="auto" w:fill="F2F2F2"/>
+            <w:tcMar>
+              <w:top w:w="60" w:type="dxa"/>
+              <w:left w:w="100" w:type="dxa"/>
+              <w:bottom w:w="60" w:type="dxa"/>
+              <w:right w:w="100" w:type="dxa"/>
+            </w:tcMar>
+          </w:tcPr>
+          <w:p>
+            <w:r>
+              <w:rPr>
+                <w:sz w:val="18"/>
+                <w:szCs w:val="18"/>
+              </w:rPr>
+              <w:t>El régimen especial suma 12.85 a 17.23 puntos en ambos estratos. Salud solo suma 5.67 puntos dentro del régimen especial</w:t>
             </w:r>
           </w:p>
         </w:tc>
@@ -1559,7 +2219,7 @@
           <w:sz w:val="22"/>
           <w:szCs w:val="22"/>
         </w:rPr>
-        <w:t>En todos los casos el efecto agregado sobre toda la población va de débil a moderado, pero en cada prueba se identificó al menos un grupo puntual cuya diferencia frente al resto supera claramente el umbral de relevancia práctica definido previamente. Sector es la excepción más notable, con el efecto más fuerte de todo el análisis y dos hallazgos de alto volumen y alta tasa.</w:t>
+        <w:t>En todos los casos el efecto agregado va de despreciable a moderado, pero en la mayoría de las pruebas se identificó al menos un grupo cuya diferencia frente al resto supera el umbral de relevancia práctica definido previamente. También se reportan los resultados que no fueron significativos o no alcanzaron el umbral: la diferencia en días de adición entre Licitación pública y Mínima cuantía, el valor del contrato en Selección Abreviada Sin Manifestación de Interés, y el carácter centralizado de la entidad.</w:t>
       </w:r>
     </w:p>
     <w:p>
@@ -1581,7 +2241,7 @@
           <w:sz w:val="22"/>
           <w:szCs w:val="22"/>
         </w:rPr>
-        <w:t>La siguiente tabla consolida, para cada modalidad de contratación, el número de contratos, la adición de plazo promedio, y los porcentajes de no ejecución y de cierre sin liquidar.</w:t>
+        <w:t>La siguiente tabla consolida, para cada modalidad de contratación, el número de contratos del periodo, la adición de plazo promedio, y los porcentajes de no ejecución y de cierre sin liquidar, estos dos últimos sobre los contratos cerrados o terminados.</w:t>
       </w:r>
     </w:p>
     <w:tbl>
@@ -1862,7 +2522,7 @@
                 <w:sz w:val="18"/>
                 <w:szCs w:val="18"/>
               </w:rPr>
-              <w:t>5.001</w:t>
+              <w:t>4.092</w:t>
             </w:r>
           </w:p>
         </w:tc>
@@ -1888,7 +2548,7 @@
                 <w:sz w:val="18"/>
                 <w:szCs w:val="18"/>
               </w:rPr>
-              <w:t>5.54</w:t>
+              <w:t>4.33</w:t>
             </w:r>
           </w:p>
         </w:tc>
@@ -1914,7 +2574,7 @@
                 <w:sz w:val="18"/>
                 <w:szCs w:val="18"/>
               </w:rPr>
-              <w:t>24.42%</w:t>
+              <w:t>44.84%</w:t>
             </w:r>
           </w:p>
         </w:tc>
@@ -1940,7 +2600,7 @@
                 <w:sz w:val="18"/>
                 <w:szCs w:val="18"/>
               </w:rPr>
-              <w:t>47.76%</w:t>
+              <w:t>49.48%</w:t>
             </w:r>
           </w:p>
         </w:tc>
@@ -2005,7 +2665,7 @@
                 <w:sz w:val="18"/>
                 <w:szCs w:val="18"/>
               </w:rPr>
-              <w:t>3.938</w:t>
+              <w:t>3.163</w:t>
             </w:r>
           </w:p>
         </w:tc>
@@ -2032,7 +2692,7 @@
                 <w:sz w:val="18"/>
                 <w:szCs w:val="18"/>
               </w:rPr>
-              <w:t>5.35</w:t>
+              <w:t>3.90</w:t>
             </w:r>
           </w:p>
         </w:tc>
@@ -2059,7 +2719,7 @@
                 <w:sz w:val="18"/>
                 <w:szCs w:val="18"/>
               </w:rPr>
-              <w:t>24.89%</w:t>
+              <w:t>55.31%</w:t>
             </w:r>
           </w:p>
         </w:tc>
@@ -2086,7 +2746,7 @@
                 <w:sz w:val="18"/>
                 <w:szCs w:val="18"/>
               </w:rPr>
-              <w:t>65.20%</w:t>
+              <w:t>66.07%</w:t>
             </w:r>
           </w:p>
         </w:tc>
@@ -2149,7 +2809,7 @@
                 <w:sz w:val="18"/>
                 <w:szCs w:val="18"/>
               </w:rPr>
-              <w:t>19.250</w:t>
+              <w:t>13.699</w:t>
             </w:r>
           </w:p>
         </w:tc>
@@ -2175,7 +2835,7 @@
                 <w:sz w:val="18"/>
                 <w:szCs w:val="18"/>
               </w:rPr>
-              <w:t>3.67</w:t>
+              <w:t>2.57</w:t>
             </w:r>
           </w:p>
         </w:tc>
@@ -2201,7 +2861,7 @@
                 <w:sz w:val="18"/>
                 <w:szCs w:val="18"/>
               </w:rPr>
-              <w:t>26.93%</w:t>
+              <w:t>60.33%</w:t>
             </w:r>
           </w:p>
         </w:tc>
@@ -2227,7 +2887,7 @@
                 <w:sz w:val="18"/>
                 <w:szCs w:val="18"/>
               </w:rPr>
-              <w:t>72.14%</w:t>
+              <w:t>72.16%</w:t>
             </w:r>
           </w:p>
         </w:tc>
@@ -2292,7 +2952,7 @@
                 <w:sz w:val="18"/>
                 <w:szCs w:val="18"/>
               </w:rPr>
-              <w:t>6.154</w:t>
+              <w:t>4.820</w:t>
             </w:r>
           </w:p>
         </w:tc>
@@ -2319,7 +2979,7 @@
                 <w:sz w:val="18"/>
                 <w:szCs w:val="18"/>
               </w:rPr>
-              <w:t>14.21</w:t>
+              <w:t>9.97</w:t>
             </w:r>
           </w:p>
         </w:tc>
@@ -2346,7 +3006,7 @@
                 <w:sz w:val="18"/>
                 <w:szCs w:val="18"/>
               </w:rPr>
-              <w:t>38.64%</w:t>
+              <w:t>82.97%</w:t>
             </w:r>
           </w:p>
         </w:tc>
@@ -2373,7 +3033,7 @@
                 <w:sz w:val="18"/>
                 <w:szCs w:val="18"/>
               </w:rPr>
-              <w:t>81.74%</w:t>
+              <w:t>83.94%</w:t>
             </w:r>
           </w:p>
         </w:tc>
@@ -2436,7 +3096,7 @@
                 <w:sz w:val="18"/>
                 <w:szCs w:val="18"/>
               </w:rPr>
-              <w:t>2.330</w:t>
+              <w:t>1.767</w:t>
             </w:r>
           </w:p>
         </w:tc>
@@ -2462,7 +3122,7 @@
                 <w:sz w:val="18"/>
                 <w:szCs w:val="18"/>
               </w:rPr>
-              <w:t>18.65</w:t>
+              <w:t>15.64</w:t>
             </w:r>
           </w:p>
         </w:tc>
@@ -2488,7 +3148,7 @@
                 <w:sz w:val="18"/>
                 <w:szCs w:val="18"/>
               </w:rPr>
-              <w:t>20.34%</w:t>
+              <w:t>40.70%</w:t>
             </w:r>
           </w:p>
         </w:tc>
@@ -2514,7 +3174,7 @@
                 <w:sz w:val="18"/>
                 <w:szCs w:val="18"/>
               </w:rPr>
-              <w:t>43.91%</w:t>
+              <w:t>46.06%</w:t>
             </w:r>
           </w:p>
         </w:tc>
@@ -2579,7 +3239,7 @@
                 <w:sz w:val="18"/>
                 <w:szCs w:val="18"/>
               </w:rPr>
-              <w:t>117.753</w:t>
+              <w:t>82.576</w:t>
             </w:r>
           </w:p>
         </w:tc>
@@ -2606,7 +3266,7 @@
                 <w:sz w:val="18"/>
                 <w:szCs w:val="18"/>
               </w:rPr>
-              <w:t>2.93</w:t>
+              <w:t>2.33</w:t>
             </w:r>
           </w:p>
         </w:tc>
@@ -2633,7 +3293,7 @@
                 <w:sz w:val="18"/>
                 <w:szCs w:val="18"/>
               </w:rPr>
-              <w:t>20.06%</w:t>
+              <w:t>38.28%</w:t>
             </w:r>
           </w:p>
         </w:tc>
@@ -2660,7 +3320,7 @@
                 <w:sz w:val="18"/>
                 <w:szCs w:val="18"/>
               </w:rPr>
-              <w:t>55.70%</w:t>
+              <w:t>57.86%</w:t>
             </w:r>
           </w:p>
         </w:tc>
@@ -2723,7 +3383,7 @@
                 <w:sz w:val="18"/>
                 <w:szCs w:val="18"/>
               </w:rPr>
-              <w:t>236</w:t>
+              <w:t>186</w:t>
             </w:r>
           </w:p>
         </w:tc>
@@ -2749,7 +3409,7 @@
                 <w:sz w:val="18"/>
                 <w:szCs w:val="18"/>
               </w:rPr>
-              <w:t>17.74</w:t>
+              <w:t>10.42</w:t>
             </w:r>
           </w:p>
         </w:tc>
@@ -2775,7 +3435,7 @@
                 <w:sz w:val="18"/>
                 <w:szCs w:val="18"/>
               </w:rPr>
-              <w:t>24.15%</w:t>
+              <w:t>34.21%</w:t>
             </w:r>
           </w:p>
         </w:tc>
@@ -2801,7 +3461,7 @@
                 <w:sz w:val="18"/>
                 <w:szCs w:val="18"/>
               </w:rPr>
-              <w:t>28.06%</w:t>
+              <w:t>28.95%</w:t>
             </w:r>
           </w:p>
         </w:tc>
@@ -2866,7 +3526,7 @@
                 <w:sz w:val="18"/>
                 <w:szCs w:val="18"/>
               </w:rPr>
-              <w:t>8.822</w:t>
+              <w:t>6.224</w:t>
             </w:r>
           </w:p>
         </w:tc>
@@ -2893,7 +3553,7 @@
                 <w:sz w:val="18"/>
                 <w:szCs w:val="18"/>
               </w:rPr>
-              <w:t>8.35</w:t>
+              <w:t>6.36</w:t>
             </w:r>
           </w:p>
         </w:tc>
@@ -2920,7 +3580,7 @@
                 <w:sz w:val="18"/>
                 <w:szCs w:val="18"/>
               </w:rPr>
-              <w:t>25.56%</w:t>
+              <w:t>46.24%</w:t>
             </w:r>
           </w:p>
         </w:tc>
@@ -2947,7 +3607,7 @@
                 <w:sz w:val="18"/>
                 <w:szCs w:val="18"/>
               </w:rPr>
-              <w:t>46.15%</w:t>
+              <w:t>48.42%</w:t>
             </w:r>
           </w:p>
         </w:tc>
@@ -3010,7 +3670,7 @@
                 <w:sz w:val="18"/>
                 <w:szCs w:val="18"/>
               </w:rPr>
-              <w:t>32.907</w:t>
+              <w:t>23.326</w:t>
             </w:r>
           </w:p>
         </w:tc>
@@ -3036,7 +3696,7 @@
                 <w:sz w:val="18"/>
                 <w:szCs w:val="18"/>
               </w:rPr>
-              <w:t>9.60</w:t>
+              <w:t>6.56</w:t>
             </w:r>
           </w:p>
         </w:tc>
@@ -3062,7 +3722,7 @@
                 <w:sz w:val="18"/>
                 <w:szCs w:val="18"/>
               </w:rPr>
-              <w:t>20.15%</w:t>
+              <w:t>37.17%</w:t>
             </w:r>
           </w:p>
         </w:tc>
@@ -3088,7 +3748,7 @@
                 <w:sz w:val="18"/>
                 <w:szCs w:val="18"/>
               </w:rPr>
-              <w:t>44.37%</w:t>
+              <w:t>46.84%</w:t>
             </w:r>
           </w:p>
         </w:tc>
@@ -3207,7 +3867,7 @@
                 <w:sz w:val="18"/>
                 <w:szCs w:val="18"/>
               </w:rPr>
-              <w:t>N°</w:t>
+              <w:t>N° contratos cerrados o terminados</w:t>
             </w:r>
             <w:proofErr w:type="spellEnd"/>
             <w:r>
@@ -3218,7 +3878,6 @@
                 <w:sz w:val="18"/>
                 <w:szCs w:val="18"/>
               </w:rPr>
-              <w:t xml:space="preserve"> contratos</w:t>
             </w:r>
           </w:p>
         </w:tc>
@@ -3315,7 +3974,7 @@
                 <w:sz w:val="18"/>
                 <w:szCs w:val="18"/>
               </w:rPr>
-              <w:t>Ley de Justicia</w:t>
+              <w:t>Salud y Protección Social</w:t>
             </w:r>
           </w:p>
         </w:tc>
@@ -3341,7 +4000,7 @@
                 <w:sz w:val="18"/>
                 <w:szCs w:val="18"/>
               </w:rPr>
-              <w:t>8.676</w:t>
+              <w:t>9.286</w:t>
             </w:r>
           </w:p>
         </w:tc>
@@ -3367,7 +4026,7 @@
                 <w:sz w:val="18"/>
                 <w:szCs w:val="18"/>
               </w:rPr>
-              <w:t>71.35%</w:t>
+              <w:t>73.36%</w:t>
             </w:r>
           </w:p>
         </w:tc>
@@ -3393,7 +4052,7 @@
                 <w:sz w:val="18"/>
                 <w:szCs w:val="18"/>
               </w:rPr>
-              <w:t>Foco de riesgo principal, alto volumen y alta tasa</w:t>
+              <w:t>Alta tasa, explicada en buena parte por el régimen especial de sus hospitales</w:t>
             </w:r>
           </w:p>
         </w:tc>
@@ -3431,7 +4090,7 @@
                 <w:sz w:val="18"/>
                 <w:szCs w:val="18"/>
               </w:rPr>
-              <w:t>Salud y Protección Social</w:t>
+              <w:t>Ley de Justicia</w:t>
             </w:r>
           </w:p>
         </w:tc>
@@ -3458,7 +4117,7 @@
                 <w:sz w:val="18"/>
                 <w:szCs w:val="18"/>
               </w:rPr>
-              <w:t>11.097</w:t>
+              <w:t>6.265</w:t>
             </w:r>
           </w:p>
         </w:tc>
@@ -3485,7 +4144,7 @@
                 <w:sz w:val="18"/>
                 <w:szCs w:val="18"/>
               </w:rPr>
-              <w:t>70.67%</w:t>
+              <w:t>70.73%</w:t>
             </w:r>
           </w:p>
         </w:tc>
@@ -3549,7 +4208,7 @@
                 <w:sz w:val="18"/>
                 <w:szCs w:val="18"/>
               </w:rPr>
-              <w:t>Ciencia Tecnología</w:t>
+              <w:t>Educación Nacional</w:t>
             </w:r>
           </w:p>
         </w:tc>
@@ -3575,7 +4234,7 @@
                 <w:sz w:val="18"/>
                 <w:szCs w:val="18"/>
               </w:rPr>
-              <w:t>321</w:t>
+              <w:t>3.679</w:t>
             </w:r>
           </w:p>
         </w:tc>
@@ -3601,7 +4260,7 @@
                 <w:sz w:val="18"/>
                 <w:szCs w:val="18"/>
               </w:rPr>
-              <w:t>90.97%</w:t>
+              <w:t>68.42%</w:t>
             </w:r>
           </w:p>
         </w:tc>
@@ -3627,7 +4286,7 @@
                 <w:sz w:val="18"/>
                 <w:szCs w:val="18"/>
               </w:rPr>
-              <w:t>Tasa más alta, pero muestra pequeña, tratar con cautela</w:t>
+              <w:t>Foco de riesgo, alto volumen y alta tasa</w:t>
             </w:r>
           </w:p>
         </w:tc>
@@ -3665,7 +4324,7 @@
                 <w:sz w:val="18"/>
                 <w:szCs w:val="18"/>
               </w:rPr>
-              <w:t>Servicio Público</w:t>
+              <w:t>Ciencia Tecnología</w:t>
             </w:r>
           </w:p>
         </w:tc>
@@ -3692,7 +4351,7 @@
                 <w:sz w:val="18"/>
                 <w:szCs w:val="18"/>
               </w:rPr>
-              <w:t>17.594</w:t>
+              <w:t>272</w:t>
             </w:r>
           </w:p>
         </w:tc>
@@ -3719,7 +4378,7 @@
                 <w:sz w:val="18"/>
                 <w:szCs w:val="18"/>
               </w:rPr>
-              <w:t>54.30%</w:t>
+              <w:t>92.28%</w:t>
             </w:r>
           </w:p>
         </w:tc>
@@ -3746,7 +4405,7 @@
                 <w:sz w:val="18"/>
                 <w:szCs w:val="18"/>
               </w:rPr>
-              <w:t>Segundo mayor volumen entre cerrados o terminados, riesgo cercano al promedio</w:t>
+              <w:t>Tasa más alta, pero muestra pequeña, tratar con cautela</w:t>
             </w:r>
             <w:proofErr w:type="spellStart"/>
             <w:r>
@@ -3797,8 +4456,7 @@
                 <w:sz w:val="18"/>
                 <w:szCs w:val="18"/>
               </w:rPr>
-              <w:lastRenderedPageBreak/>
-              <w:t>defensa</w:t>
+              <w:t>Servicio Público</w:t>
             </w:r>
           </w:p>
         </w:tc>
@@ -3824,7 +4482,7 @@
                 <w:sz w:val="18"/>
                 <w:szCs w:val="18"/>
               </w:rPr>
-              <w:t>23.539</w:t>
+              <w:t>13.138</w:t>
             </w:r>
           </w:p>
         </w:tc>
@@ -3850,7 +4508,7 @@
                 <w:sz w:val="18"/>
                 <w:szCs w:val="18"/>
               </w:rPr>
-              <w:t>33.10%</w:t>
+              <w:t>57.97%</w:t>
             </w:r>
           </w:p>
         </w:tc>
@@ -3876,7 +4534,7 @@
                 <w:sz w:val="18"/>
                 <w:szCs w:val="18"/>
               </w:rPr>
-              <w:t>Mayor volumen entre cerrados o terminados, riesgo bajo</w:t>
+              <w:t>Segundo mayor volumen entre cerrados o terminados, riesgo cercano al promedio</w:t>
             </w:r>
           </w:p>
         </w:tc>
@@ -3914,6 +4572,125 @@
                 <w:sz w:val="18"/>
                 <w:szCs w:val="18"/>
               </w:rPr>
+              <w:t>defensa</w:t>
+            </w:r>
+          </w:p>
+        </w:tc>
+        <w:tc>
+          <w:tcPr>
+            <w:tcW w:w="1600" w:type="dxa"/>
+            <w:tcBorders>
+              <w:top w:val="single" w:sz="2" w:space="0" w:color="BFBFBF"/>
+              <w:left w:val="single" w:sz="2" w:space="0" w:color="BFBFBF"/>
+              <w:bottom w:val="single" w:sz="2" w:space="0" w:color="BFBFBF"/>
+              <w:right w:val="single" w:sz="2" w:space="0" w:color="BFBFBF"/>
+            </w:tcBorders>
+            <w:shd w:val="clear" w:color="auto" w:fill="F2F2F2"/>
+            <w:tcMar>
+              <w:top w:w="60" w:type="dxa"/>
+              <w:left w:w="100" w:type="dxa"/>
+              <w:bottom w:w="60" w:type="dxa"/>
+              <w:right w:w="100" w:type="dxa"/>
+            </w:tcMar>
+          </w:tcPr>
+          <w:p>
+            <w:r>
+              <w:rPr>
+                <w:sz w:val="18"/>
+                <w:szCs w:val="18"/>
+              </w:rPr>
+              <w:t>17.335</w:t>
+            </w:r>
+          </w:p>
+        </w:tc>
+        <w:tc>
+          <w:tcPr>
+            <w:tcW w:w="1500" w:type="dxa"/>
+            <w:tcBorders>
+              <w:top w:val="single" w:sz="2" w:space="0" w:color="BFBFBF"/>
+              <w:left w:val="single" w:sz="2" w:space="0" w:color="BFBFBF"/>
+              <w:bottom w:val="single" w:sz="2" w:space="0" w:color="BFBFBF"/>
+              <w:right w:val="single" w:sz="2" w:space="0" w:color="BFBFBF"/>
+            </w:tcBorders>
+            <w:shd w:val="clear" w:color="auto" w:fill="F2F2F2"/>
+            <w:tcMar>
+              <w:top w:w="60" w:type="dxa"/>
+              <w:left w:w="100" w:type="dxa"/>
+              <w:bottom w:w="60" w:type="dxa"/>
+              <w:right w:w="100" w:type="dxa"/>
+            </w:tcMar>
+          </w:tcPr>
+          <w:p>
+            <w:r>
+              <w:rPr>
+                <w:sz w:val="18"/>
+                <w:szCs w:val="18"/>
+              </w:rPr>
+              <w:t>32.87%</w:t>
+            </w:r>
+          </w:p>
+        </w:tc>
+        <w:tc>
+          <w:tcPr>
+            <w:tcW w:w="2600" w:type="dxa"/>
+            <w:tcBorders>
+              <w:top w:val="single" w:sz="2" w:space="0" w:color="BFBFBF"/>
+              <w:left w:val="single" w:sz="2" w:space="0" w:color="BFBFBF"/>
+              <w:bottom w:val="single" w:sz="2" w:space="0" w:color="BFBFBF"/>
+              <w:right w:val="single" w:sz="2" w:space="0" w:color="BFBFBF"/>
+            </w:tcBorders>
+            <w:shd w:val="clear" w:color="auto" w:fill="F2F2F2"/>
+            <w:tcMar>
+              <w:top w:w="60" w:type="dxa"/>
+              <w:left w:w="100" w:type="dxa"/>
+              <w:bottom w:w="60" w:type="dxa"/>
+              <w:right w:w="100" w:type="dxa"/>
+            </w:tcMar>
+          </w:tcPr>
+          <w:p>
+            <w:r>
+              <w:rPr>
+                <w:sz w:val="18"/>
+                <w:szCs w:val="18"/>
+              </w:rPr>
+              <w:t>Mayor volumen entre cerrados o terminados, riesgo bajo</w:t>
+            </w:r>
+          </w:p>
+        </w:tc>
+      </w:tr>
+      <w:tr>
+        <w:tblPrEx>
+          <w:tblCellMar>
+            <w:top w:w="0" w:type="dxa"/>
+            <w:bottom w:w="0" w:type="dxa"/>
+          </w:tblCellMar>
+        </w:tblPrEx>
+        <w:trPr>
+          <w:cantSplit/>
+        </w:trPr>
+        <w:tc>
+          <w:tcPr>
+            <w:tcW w:w="3300" w:type="dxa"/>
+            <w:tcBorders>
+              <w:top w:val="single" w:sz="2" w:space="0" w:color="BFBFBF"/>
+              <w:left w:val="single" w:sz="2" w:space="0" w:color="BFBFBF"/>
+              <w:bottom w:val="single" w:sz="2" w:space="0" w:color="BFBFBF"/>
+              <w:right w:val="single" w:sz="2" w:space="0" w:color="BFBFBF"/>
+            </w:tcBorders>
+            <w:shd w:val="clear" w:color="auto" w:fill="F2F2F2"/>
+            <w:tcMar>
+              <w:top w:w="60" w:type="dxa"/>
+              <w:left w:w="100" w:type="dxa"/>
+              <w:bottom w:w="60" w:type="dxa"/>
+              <w:right w:w="100" w:type="dxa"/>
+            </w:tcMar>
+          </w:tcPr>
+          <w:p>
+            <w:r>
+              <w:rPr>
+                <w:sz w:val="18"/>
+                <w:szCs w:val="18"/>
+              </w:rPr>
               <w:t>Inteligencia Estratégica y Contrainteligencia</w:t>
             </w:r>
           </w:p>
@@ -3941,7 +4718,7 @@
                 <w:sz w:val="18"/>
                 <w:szCs w:val="18"/>
               </w:rPr>
-              <w:t>31</w:t>
+              <w:t>25</w:t>
             </w:r>
           </w:p>
         </w:tc>
@@ -3968,7 +4745,7 @@
                 <w:sz w:val="18"/>
                 <w:szCs w:val="18"/>
               </w:rPr>
-              <w:t>25.81%</w:t>
+              <w:t>32.00%</w:t>
             </w:r>
           </w:p>
         </w:tc>
@@ -4028,7 +4805,7 @@
           <w:sz w:val="22"/>
           <w:szCs w:val="22"/>
         </w:rPr>
-        <w:t>Esta visualización combina las tres señales de desviación en un solo gráfico. Cada punto es una modalidad de contratación, el eje X es el porcentaje de contratos no ejecutados, el eje Y es el porcentaje de contratos sin liquidar, el tamaño de la burbuja representa el número de contratos, y el color representa la adición de plazo promedio en días. Las líneas punteadas marcan el promedio general de cada señal.</w:t>
+        <w:t>Esta visualización combina las tres señales de desviación en un solo gráfico. Cada punto es una modalidad de contratación, el eje X es el porcentaje de contratos cerrados o terminados sin pagos registrados, el eje Y es el porcentaje de contratos cerrados o terminados sin liquidar, el tamaño de la burbuja representa el número de contratos, y el color representa la adición de plazo promedio en días. Las líneas punteadas marcan el promedio general de cada señal.</w:t>
       </w:r>
     </w:p>
     <w:p>
@@ -4041,7 +4818,7 @@
         </w:rPr>
         <w:drawing>
           <wp:inline distT="0" distB="0" distL="0" distR="0" wp14:anchorId="0D8933D0" wp14:editId="600A6B79">
-            <wp:extent cx="5334000" cy="3971925"/>
+            <wp:extent cx="5334000" cy="4135289"/>
             <wp:effectExtent l="0" t="0" r="0" b="0"/>
             <wp:docPr id="1" name="Imagen 1"/>
             <wp:cNvGraphicFramePr>
@@ -4066,7 +4843,7 @@
                   <pic:spPr bwMode="auto">
                     <a:xfrm>
                       <a:off x="0" y="0"/>
-                      <a:ext cx="5334000" cy="3971925"/>
+                      <a:ext cx="5334000" cy="4135289"/>
                     </a:xfrm>
                     <a:prstGeom prst="rect">
                       <a:avLst/>
@@ -4092,7 +4869,7 @@
           <w:sz w:val="18"/>
           <w:szCs w:val="18"/>
         </w:rPr>
-        <w:t>Figura 1. Riesgo por modalidad de contratación: no ejecución, sin liquidar y adición de plazo.</w:t>
+        <w:t>Figura 1. Riesgo por modalidad de contratación: no ejecución, sin liquidar y adición de plazo (2020-2024).</w:t>
       </w:r>
     </w:p>
     <w:p>
@@ -4104,29 +4881,25 @@
           <w:sz w:val="22"/>
           <w:szCs w:val="22"/>
         </w:rPr>
-        <w:t xml:space="preserve">Contratación régimen especial (con ofertas) queda claramente aislada en la esquina superior derecha, con los porcentajes más altos de no ejecución y de sin liquidar. Licitación pública, en cambio, se ubica por debajo del promedio en ambos </w:t>
+        <w:t>Contratación régimen especial (con ofertas) queda claramente aislada en la esquina superior derecha, con los porcentajes más altos de no ejecución (82.97%) y de sin liquidar (83.94%), y Contratación régimen especial y Contratación directa también quedan por encima de ambos promedios. Licitación pública, en cambio, se ubica por debajo del promedio en ambos ejes, pero tiene la adición de plazo promedio más alta (15.64 días), lo que confirma que su riesgo es específico a los plazos. Mínima cuantía se ubica cerca de ambas líneas de referencia, coherente con que esta modalidad concentra el 59% de los contratos del periodo y define en buena parte el promedio general.</w:t>
       </w:r>
       <w:r>
         <w:rPr>
           <w:sz w:val="22"/>
           <w:szCs w:val="22"/>
         </w:rPr>
-        <w:t>ejes,</w:t>
       </w:r>
       <w:r>
         <w:rPr>
           <w:sz w:val="22"/>
           <w:szCs w:val="22"/>
         </w:rPr>
-        <w:t xml:space="preserve"> pero tiene la adición de plazo promedio más alta, lo que confirma que su riesgo es específico a los plazos y no se traslada </w:t>
       </w:r>
       <w:r>
         <w:rPr>
           <w:sz w:val="22"/>
           <w:szCs w:val="22"/>
         </w:rPr>
-        <w:lastRenderedPageBreak/>
-        <w:t>a las otras dos señales. Mínima cuantía se ubica prácticamente sobre ambas líneas de referencia, coherente con que esta modalidad concentra el 60% del volumen total y define en buena parte el promedio general.</w:t>
       </w:r>
     </w:p>
     <w:p>
@@ -4160,7 +4933,7 @@
         </w:rPr>
         <w:drawing>
           <wp:inline distT="0" distB="0" distL="0" distR="0" wp14:anchorId="73BDB338" wp14:editId="0AC9ECC8">
-            <wp:extent cx="5334000" cy="2857500"/>
+            <wp:extent cx="5334000" cy="2866401"/>
             <wp:effectExtent l="0" t="0" r="0" b="0"/>
             <wp:docPr id="1104069223" name="Imagen 1104069223"/>
             <wp:cNvGraphicFramePr>
@@ -4185,7 +4958,7 @@
                   <pic:spPr bwMode="auto">
                     <a:xfrm>
                       <a:off x="0" y="0"/>
-                      <a:ext cx="5334000" cy="2857500"/>
+                      <a:ext cx="5334000" cy="2866401"/>
                     </a:xfrm>
                     <a:prstGeom prst="rect">
                       <a:avLst/>
@@ -4211,7 +4984,7 @@
           <w:sz w:val="18"/>
           <w:szCs w:val="18"/>
         </w:rPr>
-        <w:t>Figura 2. Distribución del valor del contrato por modalidad, según estado de liquidación.</w:t>
+        <w:t>Figura 2. Distribución del valor del contrato por modalidad, según estado de liquidación (2020-2024).</w:t>
       </w:r>
     </w:p>
     <w:p>
@@ -4408,7 +5181,7 @@
                 <w:sz w:val="18"/>
                 <w:szCs w:val="18"/>
               </w:rPr>
-              <w:t>$112.954.400</w:t>
+              <w:t>$119.049.892</w:t>
             </w:r>
           </w:p>
         </w:tc>
@@ -4434,7 +5207,7 @@
                 <w:sz w:val="18"/>
                 <w:szCs w:val="18"/>
               </w:rPr>
-              <w:t>$66.331.450</w:t>
+              <w:t>$65.700.000</w:t>
             </w:r>
           </w:p>
         </w:tc>
@@ -4499,7 +5272,7 @@
                 <w:sz w:val="18"/>
                 <w:szCs w:val="18"/>
               </w:rPr>
-              <w:t>$53.886.500</w:t>
+              <w:t>$48.538.268</w:t>
             </w:r>
           </w:p>
         </w:tc>
@@ -4526,7 +5299,7 @@
                 <w:sz w:val="18"/>
                 <w:szCs w:val="18"/>
               </w:rPr>
-              <w:t>$45.000.000</w:t>
+              <w:t>$43.696.800</w:t>
             </w:r>
           </w:p>
         </w:tc>
@@ -4589,7 +5362,7 @@
                 <w:sz w:val="18"/>
                 <w:szCs w:val="18"/>
               </w:rPr>
-              <w:t>$41.865.350</w:t>
+              <w:t>$40.000.000</w:t>
             </w:r>
           </w:p>
         </w:tc>
@@ -4615,7 +5388,7 @@
                 <w:sz w:val="18"/>
                 <w:szCs w:val="18"/>
               </w:rPr>
-              <w:t>$27.817.440</w:t>
+              <w:t>$30.000.000</w:t>
             </w:r>
           </w:p>
         </w:tc>
@@ -4680,7 +5453,7 @@
                 <w:sz w:val="18"/>
                 <w:szCs w:val="18"/>
               </w:rPr>
-              <w:t>$87.404.190</w:t>
+              <w:t>$93.698.066</w:t>
             </w:r>
           </w:p>
         </w:tc>
@@ -4707,7 +5480,7 @@
                 <w:sz w:val="18"/>
                 <w:szCs w:val="18"/>
               </w:rPr>
-              <w:t>$54.498.620</w:t>
+              <w:t>$55.014.960</w:t>
             </w:r>
           </w:p>
         </w:tc>
@@ -4770,7 +5543,7 @@
                 <w:sz w:val="18"/>
                 <w:szCs w:val="18"/>
               </w:rPr>
-              <w:t>$900.000.000</w:t>
+              <w:t>$983.654.000</w:t>
             </w:r>
           </w:p>
         </w:tc>
@@ -4796,7 +5569,7 @@
                 <w:sz w:val="18"/>
                 <w:szCs w:val="18"/>
               </w:rPr>
-              <w:t>$1.221.053.000</w:t>
+              <w:t>$1.227.095.295</w:t>
             </w:r>
           </w:p>
         </w:tc>
@@ -4861,7 +5634,7 @@
                 <w:sz w:val="18"/>
                 <w:szCs w:val="18"/>
               </w:rPr>
-              <w:t>$24.997.190</w:t>
+              <w:t>$24.903.082</w:t>
             </w:r>
           </w:p>
         </w:tc>
@@ -4888,7 +5661,7 @@
                 <w:sz w:val="18"/>
                 <w:szCs w:val="18"/>
               </w:rPr>
-              <w:t>$19.091.800</w:t>
+              <w:t>$19.319.170</w:t>
             </w:r>
           </w:p>
         </w:tc>
@@ -4925,7 +5698,6 @@
                 <w:sz w:val="18"/>
                 <w:szCs w:val="18"/>
               </w:rPr>
-              <w:lastRenderedPageBreak/>
               <w:t>Selección Abreviada Menor Cuantía Sin Manifestación Interés</w:t>
             </w:r>
           </w:p>
@@ -4952,7 +5724,7 @@
                 <w:sz w:val="18"/>
                 <w:szCs w:val="18"/>
               </w:rPr>
-              <w:t>$227.207.300</w:t>
+              <w:t>$355.792.150</w:t>
             </w:r>
           </w:p>
         </w:tc>
@@ -4978,7 +5750,7 @@
                 <w:sz w:val="18"/>
                 <w:szCs w:val="18"/>
               </w:rPr>
-              <w:t>$472.678.700</w:t>
+              <w:t>$415.494.541</w:t>
             </w:r>
           </w:p>
         </w:tc>
@@ -5043,7 +5815,7 @@
                 <w:sz w:val="18"/>
                 <w:szCs w:val="18"/>
               </w:rPr>
-              <w:t>$209.529.000</w:t>
+              <w:t>$214.399.078</w:t>
             </w:r>
           </w:p>
         </w:tc>
@@ -5070,7 +5842,7 @@
                 <w:sz w:val="18"/>
                 <w:szCs w:val="18"/>
               </w:rPr>
-              <w:t>$165.224.400</w:t>
+              <w:t>$165.023.650</w:t>
             </w:r>
           </w:p>
         </w:tc>
@@ -5133,7 +5905,7 @@
                 <w:sz w:val="18"/>
                 <w:szCs w:val="18"/>
               </w:rPr>
-              <w:t>$231.018.200</w:t>
+              <w:t>$229.884.223</w:t>
             </w:r>
           </w:p>
         </w:tc>
@@ -5159,7 +5931,7 @@
                 <w:sz w:val="18"/>
                 <w:szCs w:val="18"/>
               </w:rPr>
-              <w:t>$187.622.800</w:t>
+              <w:t>$186.098.688</w:t>
             </w:r>
           </w:p>
         </w:tc>
@@ -5179,7 +5951,7 @@
           <w:sz w:val="22"/>
           <w:szCs w:val="22"/>
         </w:rPr>
-        <w:t>En 7 de las 9 modalidades, la mediana del valor es más alta entre los contratos liquidados que entre los sin liquidar, lo que sugiere que dentro de la mayoría de las modalidades son los contratos de menor valor los que tienden a quedar sin liquidar. La excepción más relevante es Licitación pública, donde los contratos sin liquidar tienen una mediana de valor mayor que los liquidados (1.221 millones frente a 900 millones), lo que indica que en la modalidad de mayor cuantía son justamente los contratos más costosos los que tienden a quedar sin liquidar.</w:t>
+        <w:t>En 7 de las 9 modalidades, la mediana del valor es más alta entre los contratos liquidados que entre los sin liquidar, lo que sugiere que dentro de la mayoría de las modalidades son los contratos de menor valor los que tienden a quedar sin liquidar. Las pruebas de Mann-Whitney U por modalidad, con corrección de Bonferroni, confirman diferencias significativas en 8 de las 9, aunque con efectos pequeños. La excepción relevante es Licitación pública, donde los contratos sin liquidar tienen mayor valor que los liquidados (mediana de 1.227 millones frente a 984 millones, p = 0.0009), lo que indica que en la modalidad de mayor cuantía son justamente los contratos más costosos los que tienden a quedar sin liquidar. En Selección Abreviada Sin Manifestación de Interés la diferencia no es significativa (p = 0.83), así que no se usa como criterio.</w:t>
       </w:r>
       <w:r>
         <w:rPr>
@@ -5225,7 +5997,7 @@
         </w:rPr>
         <w:drawing>
           <wp:inline distT="0" distB="0" distL="0" distR="0" wp14:anchorId="1625CAA6" wp14:editId="7F8D76BD">
-            <wp:extent cx="4572000" cy="3771900"/>
+            <wp:extent cx="4572000" cy="3764181"/>
             <wp:effectExtent l="0" t="0" r="0" b="0"/>
             <wp:docPr id="1512319831" name="Imagen 1512319831"/>
             <wp:cNvGraphicFramePr>
@@ -5250,7 +6022,7 @@
                   <pic:spPr bwMode="auto">
                     <a:xfrm>
                       <a:off x="0" y="0"/>
-                      <a:ext cx="4572000" cy="3771900"/>
+                      <a:ext cx="4572000" cy="3764181"/>
                     </a:xfrm>
                     <a:prstGeom prst="rect">
                       <a:avLst/>
@@ -5276,7 +6048,7 @@
           <w:sz w:val="18"/>
           <w:szCs w:val="18"/>
         </w:rPr>
-        <w:t>Figura 3. Porcentaje de cierre sin liquidar por sector.</w:t>
+        <w:t>Figura 3. Porcentaje de cierre sin liquidar por sector (2020-2024).</w:t>
       </w:r>
     </w:p>
     <w:p>
@@ -5288,7 +6060,95 @@
           <w:sz w:val="22"/>
           <w:szCs w:val="22"/>
         </w:rPr>
-        <w:t>El riesgo por sector no está relacionado con el volumen de contratos. Ley de Justicia (8.676 contratos, 71.35%) y Salud y Protección Social (11.097 contratos, 70.67%) se ubican claramente por encima del promedio general (55.31%) y combinan una tasa alta con una muestra grande, lo que los convierte en los hallazgos más sólidos y accionables de todo el análisis. defensa, el sector de mayor volumen entre los contratos cerrados o terminados (23.539 contratos), se ubica muy por debajo del promedio (33.10%), y Servicio Público, el segundo en volumen (17.594 contratos), se ubica prácticamente sobre la línea de referencia (54.30%). Los porcentajes más altos del gráfico (Ciencia Tecnología con 90.97%, Información Estadística con 78.35%) corresponden a sectores de volumen bajo (321 y 231 contratos), por lo que deben interpretarse con más cautela.</w:t>
+        <w:t>El riesgo por sector no está relacionado con el volumen de contratos. Salud y Protección Social (9.286 contratos, 73.36%), Ley de Justicia (6.265 contratos, 70.73%) y Educación Nacional (3.679 contratos, 68.42%) se ubican más de 10 puntos por encima del promedio general (57.40%) y combinan una tasa alta con una muestra grande. defensa, el sector de mayor volumen entre los contratos cerrados o terminados (17.335 contratos), se ubica muy por debajo del promedio (32.87%), y Servicio Público, el segundo en volumen (13.138 contratos), se ubica prácticamente sobre la línea de referencia (57.97%). Los porcentajes más altos del gráfico (Ciencia Tecnología con 92.28%, Información Estadística con 81.48%) corresponden a sectores de volumen bajo (272 y 189 contratos), por lo que deben interpretarse con más cautela.</w:t>
+      </w:r>
+    </w:p>
+    <w:p>
+      <w:pPr>
+        <w:pStyle w:val="Ttulo2"/>
+        <w:spacing w:before="240" w:after="120"/>
+      </w:pPr>
+      <w:r>
+        <w:t>4.4 Sector y modalidad combinados</w:t>
+      </w:r>
+    </w:p>
+    <w:p>
+      <w:pPr>
+        <w:jc w:val="both"/>
+      </w:pPr>
+      <w:r>
+        <w:rPr>
+          <w:sz w:val="22"/>
+          <w:szCs w:val="22"/>
+        </w:rPr>
+        <w:t>Salud y Protección Social y las modalidades de régimen especial aparecen como focos por separado, pero el 69.10% de los contratos de Salud se firma por régimen especial. Este mapa de calor cruza los 8 sectores de mayor volumen con todas las modalidades, ocultando las combinaciones con menos de 30 contratos, para ver si son el mismo foco.</w:t>
+      </w:r>
+    </w:p>
+    <w:p>
+      <w:pPr>
+        <w:jc w:val="center"/>
+      </w:pPr>
+      <w:r>
+        <w:drawing>
+          <wp:inline xmlns:a="http://schemas.openxmlformats.org/drawingml/2006/main" xmlns:pic="http://schemas.openxmlformats.org/drawingml/2006/picture">
+            <wp:extent cx="5486400" cy="2701983"/>
+            <wp:docPr id="1512319832" name="Picture 1512319832"/>
+            <wp:cNvGraphicFramePr>
+              <a:graphicFrameLocks noChangeAspect="1"/>
+            </wp:cNvGraphicFramePr>
+            <a:graphic>
+              <a:graphicData uri="http://schemas.openxmlformats.org/drawingml/2006/picture">
+                <pic:pic>
+                  <pic:nvPicPr>
+                    <pic:cNvPr id="0" name="nb02_54.png"/>
+                    <pic:cNvPicPr/>
+                  </pic:nvPicPr>
+                  <pic:blipFill>
+                    <a:blip r:embed="rId10"/>
+                    <a:stretch>
+                      <a:fillRect/>
+                    </a:stretch>
+                  </pic:blipFill>
+                  <pic:spPr>
+                    <a:xfrm>
+                      <a:off x="0" y="0"/>
+                      <a:ext cx="5486400" cy="2701983"/>
+                    </a:xfrm>
+                    <a:prstGeom prst="rect"/>
+                  </pic:spPr>
+                </pic:pic>
+              </a:graphicData>
+            </a:graphic>
+          </wp:inline>
+        </w:drawing>
+      </w:r>
+    </w:p>
+    <w:p>
+      <w:pPr>
+        <w:spacing w:after="260"/>
+        <w:jc w:val="center"/>
+      </w:pPr>
+      <w:r>
+        <w:rPr>
+          <w:i/>
+          <w:iCs/>
+          <w:color w:val="595959"/>
+          <w:sz w:val="18"/>
+          <w:szCs w:val="18"/>
+        </w:rPr>
+        <w:t>Figura 4. Porcentaje de contratos sin liquidar por sector y modalidad (2020-2024).</w:t>
+      </w:r>
+    </w:p>
+    <w:p>
+      <w:pPr>
+        <w:jc w:val="both"/>
+      </w:pPr>
+      <w:r>
+        <w:rPr>
+          <w:sz w:val="22"/>
+          <w:szCs w:val="22"/>
+        </w:rPr>
+        <w:t>El régimen especial tiene tasas altas en todos los sectores con suficientes contratos, cerca de 82% en Ambiente y Desarrollo Sostenible, 75% a 76% en Educación Nacional y 71% a 90% en Salud. Al estratificar, el régimen especial suma entre 12.85 y 17.23 puntos de contratos sin liquidar tanto dentro como fuera de Salud, mientras que Salud solo suma 5.67 puntos dentro del régimen especial, por debajo del umbral. El 99.45% de esos contratos de Salud corresponde a hospitales y Empresas Sociales del Estado. El foco real es el régimen especial, no el sector Salud por sí mismo. El mapa muestra además que el riesgo de Ley de Justicia se concentra en Mínima cuantía (cerca de 77%), y que defensa tiene tasas bajas en todas las modalidades.</w:t>
       </w:r>
     </w:p>
     <w:p>
@@ -5306,7 +6166,7 @@
         <w:spacing w:before="240" w:after="120"/>
       </w:pPr>
       <w:r>
-        <w:t>5.1 Foco principal: por sector</w:t>
+        <w:t>5.1 Foco transversal: modalidades de régimen especial</w:t>
       </w:r>
     </w:p>
     <w:p>
@@ -5318,7 +6178,7 @@
           <w:sz w:val="22"/>
           <w:szCs w:val="22"/>
         </w:rPr>
-        <w:t>Ley de Justicia (8.676 contratos, 71.35% sin liquidar) y Salud y Protección Social (11.097 contratos, 70.67% sin liquidar) son los hallazgos más sólidos de todo el análisis, combinan una tasa muy por encima del promedio general (55.31%) con un volumen de contratos suficientemente grande para que la estimación sea confiable. Se recomienda que estos dos sectores sean el primer criterio de focalización. En contraste, defensa, a pesar de ser el sector de mayor volumen entre los contratos cerrados o terminados (23.539 contratos), tiene una tasa de sin liquidar notablemente baja (33.10%), y Servicio Público, el segundo en volumen (17.594 contratos), se ubica prácticamente en el promedio general (54.30%), ninguno de los dos debería priorizarse por esta señal.</w:t>
+        <w:t>Contratación régimen especial (con ofertas) tiene la tasa más alta de no ejecución (82.97%) y de cierre sin liquidar (83.94%), y Contratación régimen especial también supera el promedio en ambas (60.33% y 72.16%). El efecto se mantiene dentro y fuera del sector Salud y en todos los sectores con suficientes contratos. Se recomienda como el primer criterio de focalización. Este criterio cubre además el 69.10% de los contratos de Salud, firmados casi en su totalidad por hospitales y Empresas Sociales del Estado, por lo que no hace falta un criterio aparte para ese sector. Antes de aplicarlo, la oficina de control interno debería validar si estas entidades están obligadas a liquidar según su manual de contratación (ver limitaciones).</w:t>
       </w:r>
       <w:r>
         <w:rPr>
@@ -5339,7 +6199,7 @@
         <w:spacing w:before="240" w:after="120"/>
       </w:pPr>
       <w:r>
-        <w:t>5.2 Foco secundario: por modalidad de contratación</w:t>
+        <w:t>5.2 Foco sectorial: Ley de Justicia y Educación Nacional</w:t>
       </w:r>
     </w:p>
     <w:p>
@@ -5351,7 +6211,7 @@
           <w:sz w:val="22"/>
           <w:szCs w:val="22"/>
         </w:rPr>
-        <w:t>Contratación régimen especial (con ofertas) se mantiene como un foco transversal, con el porcentaje más alto de no ejecución (38.64%) y de cierre sin liquidar (81.74%) entre todas las modalidades. Licitación pública es un foco distinto y específico, no destaca en no ejecución ni en sin liquidar, pero tiene la adición de plazo promedio más alta (18.65 días) y concentra sus contratos sin liquidar en los de mayor valor, por lo que su supervisión debería enfocarse en plazos y en los contratos de mayor cuantía dentro de esta modalidad.</w:t>
+        <w:t>Ley de Justicia (6.265 contratos, 70.73% sin liquidar) y Educación Nacional (3.679 contratos, 68.42%) combinan una tasa más de 10 puntos por encima del promedio general (57.40%) con un volumen alto. En Ley de Justicia el riesgo se concentra en sus contratos de Mínima cuantía y es independiente del régimen especial, que casi no usa. Salud y Protección Social (73.36%) no se recomienda como criterio aparte, porque su exceso se explica en buena parte por el criterio 5.1.</w:t>
       </w:r>
     </w:p>
     <w:p>
@@ -5360,7 +6220,7 @@
         <w:spacing w:before="240" w:after="120"/>
       </w:pPr>
       <w:r>
-        <w:t>5.3 El valor del contrato como criterio secundario, no independiente</w:t>
+        <w:t>5.3 Entidades territoriales y gasto de funcionamiento</w:t>
       </w:r>
     </w:p>
     <w:p>
@@ -5372,7 +6232,7 @@
           <w:sz w:val="22"/>
           <w:szCs w:val="22"/>
         </w:rPr>
-        <w:t>Al probarlo de forma aislada, el valor del contrato no superó el umbral de relevancia práctica definido (diferencia relativa de 28.71% entre medianas, frente a un umbral de 30%), y su relación con el riesgo cambia de dirección según la modalidad, en Licitación pública los contratos sin liquidar son los más costosos, mientras que en la mayoría de las demás modalidades ocurre lo contrario. Por esto, el valor del contrato debería usarse como un filtro adicional dentro de una modalidad o sector ya identificado como riesgoso, no como un criterio de focalización por sí solo.</w:t>
+        <w:t>Las entidades de orden territorial tienen 63.74% de contratos sin liquidar frente a 52.07% en las nacionales, 11.67 puntos más. Por su parte, el 48.88% de los contratos de funcionamiento cerrados o terminados no tiene pagos registrados, frente a 32.65% en inversión, una brecha de 16.23 puntos. Como parte de esta señal puede ser falta de registro en SECOP II, la supervisión de estos contratos debería empezar por confirmar con la entidad si el pago ocurrió. El carácter centralizado o descentralizado de la entidad, en cambio, no mostró una diferencia relevante (4.23 puntos) y no se recomienda como criterio.</w:t>
       </w:r>
     </w:p>
     <w:p>
@@ -5381,8 +6241,7 @@
         <w:spacing w:before="240" w:after="120"/>
       </w:pPr>
       <w:r>
-        <w:lastRenderedPageBreak/>
-        <w:t>5.4 Destino del gasto como señal de calidad de datos</w:t>
+        <w:t>5.4 Licitación pública: plazos y contratos de mayor valor</w:t>
       </w:r>
     </w:p>
     <w:p>
@@ -5394,7 +6253,7 @@
           <w:sz w:val="22"/>
           <w:szCs w:val="22"/>
         </w:rPr>
-        <w:t>La diferencia entre Funcionamiento (25.28% no ejecutado) e Inversión (16.31%) fue de apenas 8.97 puntos porcentuales, por debajo del umbral definido. Sin embargo, los registros con destino de gasto sin definir mostraron una tasa de no ejecución mucho más alta (41.69% y 46.80%), lo que sugiere que un registro incompleto en este campo podría ser en sí mismo un indicador de riesgo administrativo. Se recomienda que la oficina de control interno lo revise como una alerta de calidad de datos más que como un criterio de focalización por tipo de gasto.</w:t>
+        <w:t>El 23.71% de los contratos de Licitación pública recibió adición de plazo, frente a 6.13% en Mínima cuantía, aunque las adiciones son cortas frente a su plazo (mediana de 11.65%) y la diferencia en días (13.31) no alcanzó el umbral de 15 días. Su supervisión debería centrarse en el seguimiento del cronograma. Además, es la única modalidad donde los contratos sin liquidar son los de mayor valor, así que dentro de ella conviene priorizar los contratos más costosos. Fuera de Licitación pública, el valor del contrato no funciona como criterio independiente: usado solo no alcanzó el umbral de relevancia (29.63% frente a 30%).</w:t>
       </w:r>
     </w:p>
     <w:p>
@@ -5415,7 +6274,7 @@
           <w:sz w:val="22"/>
           <w:szCs w:val="22"/>
         </w:rPr>
-        <w:t>Mínima cuantía concentra el 60% de todos los contratos de la base de datos (117.753 de 196.391), pero sus porcentajes de no ejecución (20.06%) y de cierre sin liquidar (55.70%) están cerca del promedio general. De forma similar, Servicio Público y defensa, los dos sectores de mayor volumen, no destacan como grupos de riesgo diferencial. Priorizar supervisión únicamente por volumen, sin evidencia de riesgo diferencial, sería ineficiente frente a las modalidades y sectores con señales más claras.</w:t>
+        <w:t>Mínima cuantía concentra el 59% de los contratos del periodo (82.576 de 139.853), pero sus porcentajes de no ejecución (38.28%) y de cierre sin liquidar (57.86%) están cerca del promedio general. De forma similar, defensa, el sector de mayor volumen entre los contratos cerrados o terminados, tiene la tasa sin liquidar más baja de los sectores grandes (32.87%), y Servicio Público, el segundo, está en el promedio (57.97%). Priorizar supervisión únicamente por volumen, sin evidencia de riesgo diferencial, sería ineficiente frente a los criterios anteriores.</w:t>
       </w:r>
     </w:p>
     <w:p>
@@ -5436,21 +6295,19 @@
           <w:sz w:val="22"/>
           <w:szCs w:val="22"/>
         </w:rPr>
-        <w:t xml:space="preserve">Los cuatro factores, modalidad, valor del contrato, destino del gasto y sector, se probaron de forma independiente entre sí frente a cada señal de desviación. No se evaluaron sus interacciones, por </w:t>
+        <w:t>Salvo el cruce de Salud con régimen especial y el valor dentro de cada modalidad, los cinco factores se probaron de forma independiente frente a cada señal, sin un modelo multivariado (como una regresión logística) que controle por todos al mismo tiempo. Parte de la asociación de un factor puede explicarse por otro, por ejemplo el orden territorial y el sector.</w:t>
       </w:r>
       <w:r>
         <w:rPr>
           <w:sz w:val="22"/>
           <w:szCs w:val="22"/>
         </w:rPr>
-        <w:t>ejemplo,</w:t>
       </w:r>
       <w:r>
         <w:rPr>
           <w:sz w:val="22"/>
           <w:szCs w:val="22"/>
         </w:rPr>
-        <w:t xml:space="preserve"> si el riesgo de Ley de Justicia se concentra además en una modalidad o un rango de valor específico, ni se ajustó un modelo multivariado (como una regresión logística) que controle por todas las variables al mismo tiempo. Es posible que parte de la asociación observada en cada prueba individual se explique por otra variable no incluida en ese análisis puntual.</w:t>
       </w:r>
     </w:p>
     <w:p>
@@ -5462,7 +6319,7 @@
           <w:sz w:val="22"/>
           <w:szCs w:val="22"/>
         </w:rPr>
-        <w:t>Con un tamaño de muestra de casi 200.000 contratos, casi cualquier diferencia entre grupos resulta estadísticamente significativa, incluso cuando el tamaño del efecto es pequeño. Por esta razón, todas las conclusiones se basaron en umbrales de relevancia práctica definidos antes de cada prueba, y no únicamente en el valor p. La prueba de sector frente a cierre sin liquidar cumplió el supuesto de frecuencia esperada mínima, pero de forma ajustada (13.85, cerca del límite de 5), dado que algunos sectores como Inteligencia Estratégica y Contrainteligencia tienen muestras pequeñas (31 contratos en total).</w:t>
+        <w:t>Con 139.853 contratos casi cualquier diferencia entre grupos resulta estadísticamente significativa, incluso cuando el tamaño del efecto es pequeño. Por esta razón, las conclusiones se basaron en umbrales de relevancia práctica definidos antes de cada prueba y en el tamaño del efecto, no únicamente en el valor p. La prueba de sector cumplió el supuesto de frecuencia esperada mínima de forma ajustada (10.65), dado que algunos sectores tienen muestras pequeñas, y solo las 9 pruebas de valor por modalidad se corrigieron por comparaciones múltiples.</w:t>
       </w:r>
     </w:p>
     <w:p>
@@ -5474,7 +6331,55 @@
           <w:sz w:val="22"/>
           <w:szCs w:val="22"/>
         </w:rPr>
-        <w:t>Las banderas de no ejecución y de cierre sin liquidar son proxies construidos a partir de reglas simples, y las categorías No aplica y No Definido de destino del gasto, así como No Definido de sector (excluida de la prueba correspondiente por tener solo 9 contratos), probablemente reflejan problemas de registro o clasificación incompleta más que una categoría sustantiva, lo que limita la interpretación de esos resultados específicos.</w:t>
+        <w:t>La no ejecución puede ser falta de registro. El 15.75% de las entidades con al menos 5 contratos cerrados no registra ningún pago en SECOP II, y esas entidades aportan el 20.61% de los contratos marcados como no ejecutados. Además, el porcentaje de contratos sin pago registrado bajó de 64.02% en 2020 a 47.14% en 2024, señal de que el registro de pagos fue mejorando. Esta señal debe leerse como falta de trazabilidad financiera, no necesariamente como falta de pago.</w:t>
+      </w:r>
+      <w:r>
+        <w:rPr>
+          <w:sz w:val="22"/>
+          <w:szCs w:val="22"/>
+        </w:rPr>
+      </w:r>
+      <w:r>
+        <w:rPr>
+          <w:sz w:val="22"/>
+          <w:szCs w:val="22"/>
+        </w:rPr>
+      </w:r>
+    </w:p>
+    <w:p>
+      <w:pPr>
+        <w:jc w:val="both"/>
+      </w:pPr>
+      <w:r>
+        <w:rPr>
+          <w:sz w:val="22"/>
+          <w:szCs w:val="22"/>
+        </w:rPr>
+        <w:t>La liquidación no siempre es obligatoria. Las entidades de régimen especial, como las Empresas Sociales del Estado, contratan bajo normas de derecho privado, y la obligación de liquidar depende de su propio manual de contratación. Parte del cierre sin liquidar en el régimen especial podría no ser una desviación sino una práctica permitida.</w:t>
+      </w:r>
+      <w:r>
+        <w:rPr>
+          <w:sz w:val="22"/>
+          <w:szCs w:val="22"/>
+        </w:rPr>
+      </w:r>
+      <w:r>
+        <w:rPr>
+          <w:sz w:val="22"/>
+          <w:szCs w:val="22"/>
+        </w:rPr>
+      </w:r>
+    </w:p>
+    <w:p>
+      <w:pPr>
+        <w:jc w:val="both"/>
+      </w:pPr>
+      <w:r>
+        <w:rPr>
+          <w:sz w:val="22"/>
+          <w:szCs w:val="22"/>
+        </w:rPr>
+        <w:t>La mezcla de entidades cambia dentro del periodo. La participación del régimen especial pasó de 6.75% en 2020 a 18.93% en 2023, por la entrada de nuevas entidades a SECOP II más que por un cambio en cómo contratan. Además, los resultados aplican a contratos firmados entre 2020 y 2024: se excluyeron 2019, por su forma distinta de registro, y 2025, por tener el ciclo de vida incompleto.</w:t>
       </w:r>
       <w:r>
         <w:rPr>

</xml_diff>